<commit_message>
CR-017: add Git tool visual evidence, failure tracking roadmap, commit traceability matrix, and updated SCM review docx
</commit_message>
<xml_diff>
--- a/docs/final-review/CommitSleuth_SCM_Final_Review.docx
+++ b/docs/final-review/CommitSleuth_SCM_Final_Review.docx
@@ -4,7 +4,7 @@
   <w:body>
     <w:p>
       <w:pPr>
-        <w:spacing w:before="480" w:after="80"/>
+        <w:spacing w:before="400" w:after="80"/>
         <w:jc w:val="center"/>
       </w:pPr>
       <w:r>
@@ -39,7 +39,7 @@
     </w:p>
     <w:p>
       <w:pPr>
-        <w:spacing w:before="120" w:after="400"/>
+        <w:spacing w:before="80" w:after="360"/>
         <w:jc w:val="center"/>
       </w:pPr>
       <w:r>
@@ -51,7 +51,7 @@
     </w:p>
     <w:p>
       <w:pPr>
-        <w:spacing w:before="240" w:after="120"/>
+        <w:spacing w:before="200" w:after="120"/>
         <w:jc w:val="center"/>
       </w:pPr>
       <w:r>
@@ -77,7 +77,7 @@
     </w:p>
     <w:p>
       <w:pPr>
-        <w:spacing w:before="280" w:after="560"/>
+        <w:spacing w:before="240" w:after="480"/>
         <w:jc w:val="center"/>
       </w:pPr>
       <w:r>
@@ -95,6 +95,14 @@
         <w:tblW w:type="auto" w:w="0"/>
         <w:jc w:val="center"/>
         <w:tblLook w:firstColumn="1" w:firstRow="1" w:lastColumn="0" w:lastRow="0" w:noHBand="0" w:noVBand="1" w:val="04A0"/>
+        <w:tblBorders>
+          <w:top w:val="single" w:sz="4" w:space="0" w:color="CBD5E1"/>
+          <w:left w:val="single" w:sz="4" w:space="0" w:color="CBD5E1"/>
+          <w:bottom w:val="single" w:sz="4" w:space="0" w:color="CBD5E1"/>
+          <w:right w:val="single" w:sz="4" w:space="0" w:color="CBD5E1"/>
+          <w:insideH w:val="single" w:sz="4" w:space="0" w:color="CBD5E1"/>
+          <w:insideV w:val="single" w:sz="4" w:space="0" w:color="CBD5E1"/>
+        </w:tblBorders>
       </w:tblPr>
       <w:tblGrid>
         <w:gridCol w:w="4514"/>
@@ -105,11 +113,12 @@
           <w:tcPr>
             <w:tcW w:type="dxa" w:w="3168"/>
             <w:tcMar>
-              <w:top w:w="80" w:type="dxa"/>
-              <w:bottom w:w="80" w:type="dxa"/>
+              <w:top w:w="70" w:type="dxa"/>
+              <w:bottom w:w="70" w:type="dxa"/>
               <w:left w:w="100" w:type="dxa"/>
               <w:right w:w="100" w:type="dxa"/>
             </w:tcMar>
+            <w:shd w:val="clear" w:color="auto" w:fill="F8FAFC"/>
           </w:tcPr>
           <w:p>
             <w:pPr>
@@ -120,7 +129,7 @@
                 <w:rFonts w:ascii="Times New Roman" w:hAnsi="Times New Roman"/>
                 <w:b/>
                 <w:color w:val="0F172A"/>
-                <w:sz w:val="23"/>
+                <w:sz w:val="22"/>
               </w:rPr>
               <w:t>Course Details:</w:t>
             </w:r>
@@ -130,8 +139,8 @@
           <w:tcPr>
             <w:tcW w:type="dxa" w:w="6048"/>
             <w:tcMar>
-              <w:top w:w="80" w:type="dxa"/>
-              <w:bottom w:w="80" w:type="dxa"/>
+              <w:top w:w="70" w:type="dxa"/>
+              <w:bottom w:w="70" w:type="dxa"/>
               <w:left w:w="100" w:type="dxa"/>
               <w:right w:w="100" w:type="dxa"/>
             </w:tcMar>
@@ -144,7 +153,7 @@
               <w:rPr>
                 <w:rFonts w:ascii="Times New Roman" w:hAnsi="Times New Roman"/>
                 <w:color w:val="1E293B"/>
-                <w:sz w:val="23"/>
+                <w:sz w:val="22"/>
               </w:rPr>
               <w:t>ISWE403L — Software Configuration Management</w:t>
             </w:r>
@@ -156,11 +165,12 @@
           <w:tcPr>
             <w:tcW w:type="dxa" w:w="3168"/>
             <w:tcMar>
-              <w:top w:w="80" w:type="dxa"/>
-              <w:bottom w:w="80" w:type="dxa"/>
+              <w:top w:w="70" w:type="dxa"/>
+              <w:bottom w:w="70" w:type="dxa"/>
               <w:left w:w="100" w:type="dxa"/>
               <w:right w:w="100" w:type="dxa"/>
             </w:tcMar>
+            <w:shd w:val="clear" w:color="auto" w:fill="F8FAFC"/>
           </w:tcPr>
           <w:p>
             <w:pPr>
@@ -171,7 +181,7 @@
                 <w:rFonts w:ascii="Times New Roman" w:hAnsi="Times New Roman"/>
                 <w:b/>
                 <w:color w:val="0F172A"/>
-                <w:sz w:val="23"/>
+                <w:sz w:val="22"/>
               </w:rPr>
               <w:t>Evaluation:</w:t>
             </w:r>
@@ -181,8 +191,8 @@
           <w:tcPr>
             <w:tcW w:type="dxa" w:w="6048"/>
             <w:tcMar>
-              <w:top w:w="80" w:type="dxa"/>
-              <w:bottom w:w="80" w:type="dxa"/>
+              <w:top w:w="70" w:type="dxa"/>
+              <w:bottom w:w="70" w:type="dxa"/>
               <w:left w:w="100" w:type="dxa"/>
               <w:right w:w="100" w:type="dxa"/>
             </w:tcMar>
@@ -195,7 +205,7 @@
               <w:rPr>
                 <w:rFonts w:ascii="Times New Roman" w:hAnsi="Times New Roman"/>
                 <w:color w:val="1E293B"/>
-                <w:sz w:val="23"/>
+                <w:sz w:val="22"/>
               </w:rPr>
               <w:t>Final Tool Demonstration Evaluation (Review-III)</w:t>
             </w:r>
@@ -207,11 +217,12 @@
           <w:tcPr>
             <w:tcW w:type="dxa" w:w="3168"/>
             <w:tcMar>
-              <w:top w:w="80" w:type="dxa"/>
-              <w:bottom w:w="80" w:type="dxa"/>
+              <w:top w:w="70" w:type="dxa"/>
+              <w:bottom w:w="70" w:type="dxa"/>
               <w:left w:w="100" w:type="dxa"/>
               <w:right w:w="100" w:type="dxa"/>
             </w:tcMar>
+            <w:shd w:val="clear" w:color="auto" w:fill="F8FAFC"/>
           </w:tcPr>
           <w:p>
             <w:pPr>
@@ -222,7 +233,7 @@
                 <w:rFonts w:ascii="Times New Roman" w:hAnsi="Times New Roman"/>
                 <w:b/>
                 <w:color w:val="0F172A"/>
-                <w:sz w:val="23"/>
+                <w:sz w:val="22"/>
               </w:rPr>
               <w:t>Faculty Guide:</w:t>
             </w:r>
@@ -232,8 +243,8 @@
           <w:tcPr>
             <w:tcW w:type="dxa" w:w="6048"/>
             <w:tcMar>
-              <w:top w:w="80" w:type="dxa"/>
-              <w:bottom w:w="80" w:type="dxa"/>
+              <w:top w:w="70" w:type="dxa"/>
+              <w:bottom w:w="70" w:type="dxa"/>
               <w:left w:w="100" w:type="dxa"/>
               <w:right w:w="100" w:type="dxa"/>
             </w:tcMar>
@@ -246,7 +257,7 @@
               <w:rPr>
                 <w:rFonts w:ascii="Times New Roman" w:hAnsi="Times New Roman"/>
                 <w:color w:val="1E293B"/>
-                <w:sz w:val="23"/>
+                <w:sz w:val="22"/>
               </w:rPr>
               <w:t>Prof. Senthil Kumar P</w:t>
             </w:r>
@@ -258,11 +269,12 @@
           <w:tcPr>
             <w:tcW w:type="dxa" w:w="3168"/>
             <w:tcMar>
-              <w:top w:w="80" w:type="dxa"/>
-              <w:bottom w:w="80" w:type="dxa"/>
+              <w:top w:w="70" w:type="dxa"/>
+              <w:bottom w:w="70" w:type="dxa"/>
               <w:left w:w="100" w:type="dxa"/>
               <w:right w:w="100" w:type="dxa"/>
             </w:tcMar>
+            <w:shd w:val="clear" w:color="auto" w:fill="F8FAFC"/>
           </w:tcPr>
           <w:p>
             <w:pPr>
@@ -273,7 +285,7 @@
                 <w:rFonts w:ascii="Times New Roman" w:hAnsi="Times New Roman"/>
                 <w:b/>
                 <w:color w:val="0F172A"/>
-                <w:sz w:val="23"/>
+                <w:sz w:val="22"/>
               </w:rPr>
               <w:t>Slot:</w:t>
             </w:r>
@@ -283,8 +295,8 @@
           <w:tcPr>
             <w:tcW w:type="dxa" w:w="6048"/>
             <w:tcMar>
-              <w:top w:w="80" w:type="dxa"/>
-              <w:bottom w:w="80" w:type="dxa"/>
+              <w:top w:w="70" w:type="dxa"/>
+              <w:bottom w:w="70" w:type="dxa"/>
               <w:left w:w="100" w:type="dxa"/>
               <w:right w:w="100" w:type="dxa"/>
             </w:tcMar>
@@ -297,7 +309,7 @@
               <w:rPr>
                 <w:rFonts w:ascii="Times New Roman" w:hAnsi="Times New Roman"/>
                 <w:color w:val="1E293B"/>
-                <w:sz w:val="23"/>
+                <w:sz w:val="22"/>
               </w:rPr>
               <w:t>E1 + TE1</w:t>
             </w:r>
@@ -309,11 +321,12 @@
           <w:tcPr>
             <w:tcW w:type="dxa" w:w="3168"/>
             <w:tcMar>
-              <w:top w:w="80" w:type="dxa"/>
-              <w:bottom w:w="80" w:type="dxa"/>
+              <w:top w:w="70" w:type="dxa"/>
+              <w:bottom w:w="70" w:type="dxa"/>
               <w:left w:w="100" w:type="dxa"/>
               <w:right w:w="100" w:type="dxa"/>
             </w:tcMar>
+            <w:shd w:val="clear" w:color="auto" w:fill="F8FAFC"/>
           </w:tcPr>
           <w:p>
             <w:pPr>
@@ -324,7 +337,7 @@
                 <w:rFonts w:ascii="Times New Roman" w:hAnsi="Times New Roman"/>
                 <w:b/>
                 <w:color w:val="0F172A"/>
-                <w:sz w:val="23"/>
+                <w:sz w:val="22"/>
               </w:rPr>
               <w:t>SCM Tool Selected:</w:t>
             </w:r>
@@ -334,8 +347,8 @@
           <w:tcPr>
             <w:tcW w:type="dxa" w:w="6048"/>
             <w:tcMar>
-              <w:top w:w="80" w:type="dxa"/>
-              <w:bottom w:w="80" w:type="dxa"/>
+              <w:top w:w="70" w:type="dxa"/>
+              <w:bottom w:w="70" w:type="dxa"/>
               <w:left w:w="100" w:type="dxa"/>
               <w:right w:w="100" w:type="dxa"/>
             </w:tcMar>
@@ -348,9 +361,9 @@
               <w:rPr>
                 <w:rFonts w:ascii="Times New Roman" w:hAnsi="Times New Roman"/>
                 <w:color w:val="1E293B"/>
-                <w:sz w:val="23"/>
+                <w:sz w:val="22"/>
               </w:rPr>
-              <w:t>Git &amp; GitHub</w:t>
+              <w:t>Git &amp; GitHub (Primary SCM Toolchain)</w:t>
             </w:r>
           </w:p>
         </w:tc>
@@ -360,11 +373,12 @@
           <w:tcPr>
             <w:tcW w:type="dxa" w:w="3168"/>
             <w:tcMar>
-              <w:top w:w="80" w:type="dxa"/>
-              <w:bottom w:w="80" w:type="dxa"/>
+              <w:top w:w="70" w:type="dxa"/>
+              <w:bottom w:w="70" w:type="dxa"/>
               <w:left w:w="100" w:type="dxa"/>
               <w:right w:w="100" w:type="dxa"/>
             </w:tcMar>
+            <w:shd w:val="clear" w:color="auto" w:fill="F8FAFC"/>
           </w:tcPr>
           <w:p>
             <w:pPr>
@@ -375,7 +389,7 @@
                 <w:rFonts w:ascii="Times New Roman" w:hAnsi="Times New Roman"/>
                 <w:b/>
                 <w:color w:val="0F172A"/>
-                <w:sz w:val="23"/>
+                <w:sz w:val="22"/>
               </w:rPr>
               <w:t>GitHub Repository:</w:t>
             </w:r>
@@ -385,8 +399,8 @@
           <w:tcPr>
             <w:tcW w:type="dxa" w:w="6048"/>
             <w:tcMar>
-              <w:top w:w="80" w:type="dxa"/>
-              <w:bottom w:w="80" w:type="dxa"/>
+              <w:top w:w="70" w:type="dxa"/>
+              <w:bottom w:w="70" w:type="dxa"/>
               <w:left w:w="100" w:type="dxa"/>
               <w:right w:w="100" w:type="dxa"/>
             </w:tcMar>
@@ -399,7 +413,7 @@
               <w:rPr>
                 <w:rFonts w:ascii="Times New Roman" w:hAnsi="Times New Roman"/>
                 <w:color w:val="1E293B"/>
-                <w:sz w:val="23"/>
+                <w:sz w:val="22"/>
               </w:rPr>
               <w:t>https://github.com/prakashumapathi07-spec/COMMITSLEUTHSCM.git</w:t>
             </w:r>
@@ -409,7 +423,7 @@
     </w:tbl>
     <w:p>
       <w:pPr>
-        <w:spacing w:before="720" w:after="80"/>
+        <w:spacing w:before="640" w:after="80"/>
         <w:jc w:val="center"/>
       </w:pPr>
       <w:r>
@@ -471,7 +485,7 @@
     <w:p>
       <w:pPr>
         <w:keepNext/>
-        <w:spacing w:before="320" w:after="120"/>
+        <w:spacing w:before="360" w:after="120"/>
       </w:pPr>
       <w:r>
         <w:rPr>
@@ -528,7 +542,7 @@
     <w:p>
       <w:pPr>
         <w:keepNext/>
-        <w:spacing w:before="320" w:after="120"/>
+        <w:spacing w:before="360" w:after="120"/>
       </w:pPr>
       <w:r>
         <w:rPr>
@@ -551,7 +565,7 @@
           <w:color w:val="1E293B"/>
           <w:sz w:val="24"/>
         </w:rPr>
-        <w:t>Tool Implementation represents the foundational SCM activity that unites the software toolchain into a cohesive, automated workflow. CommitSleuth establishes an integrated pipeline connecting Git/GitHub for version control, Jenkins for continuous integration orchestration, Apache Maven for automated Java compilation and JUnit 5 Surefire test execution, Python for log parsing and heuristic attribution scoring, SQLite for persistent configuration status accounting, and Flask for an interactive, light-theme web dashboard.</w:t>
+        <w:t>Tool Implementation represents the foundational SCM activity that unites the software toolchain into a cohesive, automated workflow. CommitSleuth establishes Git and GitHub as its primary, authoritative version management backbone, tightly integrated with Apache Maven for automated Java compilation and JUnit 5 Surefire test execution, Jenkins for declarative CI/CD pipeline orchestration, Python for failure parsing and heuristic attribution scoring, SQLite for persistent configuration status accounting, and Flask for an interactive, light-theme web dashboard.</w:t>
       </w:r>
     </w:p>
     <w:p>
@@ -565,7 +579,7 @@
           <w:color w:val="1E293B"/>
           <w:sz w:val="24"/>
         </w:rPr>
-        <w:t>The realistic operational scenario implemented for CommitSleuth models TechNova Solutions, where four developers collaborate on an Employee Management System across dedicated feature branches: Prakash Raj (Employee module on feature/employee), Bharathwaraj (Authentication module on feature/login), Karthik (Reports module on feature/reports), and Divya (Database module on feature/database). When a developer commits code, GitHub triggers Jenkins through declarative pipelines defined in Jenkinsfile. Maven compiles the Java application and executes unit tests. If a failure occurs, Jenkins invokes CommitSleuth's backend build recorder, which analyzes the failure and updates the relational database in real time.</w:t>
+        <w:t>The authoritative GitHub repository (https://github.com/prakashumapathi07-spec/COMMITSLEUTHSCM.git) governs all controlled Configuration Items (CIs), branch topologies, code diffs, pull request gates, and cryptographic release tags. All project files—including build descriptors (pom.xml, Jenkinsfile), Python analysis engines (parser/, analyzer/, alerts/), database schemas, and documentation—are maintained under strict version control with enforced Change Request identifiers.</w:t>
       </w:r>
     </w:p>
     <w:p>
@@ -577,7 +591,7 @@
       <w:r>
         <w:drawing>
           <wp:inline xmlns:a="http://schemas.openxmlformats.org/drawingml/2006/main" xmlns:pic="http://schemas.openxmlformats.org/drawingml/2006/picture">
-            <wp:extent cx="5440680" cy="3088325"/>
+            <wp:extent cx="5486400" cy="3711388"/>
             <wp:docPr id="1" name="Picture 1"/>
             <wp:cNvGraphicFramePr>
               <a:graphicFrameLocks noChangeAspect="1"/>
@@ -586,7 +600,7 @@
               <a:graphicData uri="http://schemas.openxmlformats.org/drawingml/2006/picture">
                 <pic:pic>
                   <pic:nvPicPr>
-                    <pic:cNvPr id="0" name="fig01_dashboard.png"/>
+                    <pic:cNvPr id="0" name="git_01_repo_overview.png"/>
                     <pic:cNvPicPr/>
                   </pic:nvPicPr>
                   <pic:blipFill>
@@ -598,7 +612,7 @@
                   <pic:spPr>
                     <a:xfrm>
                       <a:off x="0" y="0"/>
-                      <a:ext cx="5440680" cy="3088325"/>
+                      <a:ext cx="5486400" cy="3711388"/>
                     </a:xfrm>
                     <a:prstGeom prst="rect"/>
                   </pic:spPr>
@@ -623,7 +637,7 @@
           <w:color w:val="334155"/>
           <w:sz w:val="21"/>
         </w:rPr>
-        <w:t>Figure 1: CommitSleuth Executive SCM Dashboard</w:t>
+        <w:t>Figure 1: GitHub Repository Overview &amp; File Tree Structure (COMMITSLEUTHSCM)</w:t>
       </w:r>
     </w:p>
     <w:p>
@@ -646,13 +660,234 @@
           <w:color w:val="1E293B"/>
           <w:sz w:val="24"/>
         </w:rPr>
+        <w:t>The primary GitHub repository overview illustrates the controlled repository structure for CommitSleuth under 'prakashumapathi07-spec/COMMITSLEUTHSCM'. The interface displays active branches (main, develop, feature branches), official release baseline tags (v1.0.0 Latest), the verified commit teaser for commit 70d43eb, team contributor statistics across Prakash Raj U and Bharathwaraj K S, repository languages (Java 54.2%, Python 36.4%), and the hierarchical directory tree containing Maven configurations, Python modules, database scripts, and test suites.</w:t>
+      </w:r>
+    </w:p>
+    <w:p>
+      <w:pPr>
+        <w:keepNext/>
+        <w:spacing w:before="240" w:after="80"/>
+      </w:pPr>
+      <w:r>
+        <w:rPr>
+          <w:rFonts w:ascii="Times New Roman" w:hAnsi="Times New Roman"/>
+          <w:b/>
+          <w:color w:val="1E293B"/>
+          <w:sz w:val="25"/>
+        </w:rPr>
+        <w:t>2.1 End-to-End Build Failure Tracking Roadmap</w:t>
+      </w:r>
+    </w:p>
+    <w:p>
+      <w:pPr>
+        <w:spacing w:line="324" w:lineRule="auto" w:after="120"/>
+        <w:jc w:val="both"/>
+      </w:pPr>
+      <w:r>
+        <w:rPr>
+          <w:rFonts w:ascii="Times New Roman" w:hAnsi="Times New Roman"/>
+          <w:color w:val="1E293B"/>
+          <w:sz w:val="24"/>
+        </w:rPr>
+        <w:t>To systematically eliminate the 'Blame HEAD' fallacy, CommitSleuth implements an automated 9-phase failure tracking and resolution roadmap. This roadmap coordinates developer commits, continuous integration triggers, stack trace parsing, multi-factor attribution, automated incident recording, real-time alert dispatch, interactive diagnostics, corrective commits, and promotional gating into a continuous feedback loop:</w:t>
+      </w:r>
+    </w:p>
+    <w:p>
+      <w:pPr>
+        <w:spacing w:line="324" w:lineRule="auto" w:after="120"/>
+        <w:jc w:val="both"/>
+      </w:pPr>
+      <w:r>
+        <w:rPr>
+          <w:rFonts w:ascii="Times New Roman" w:hAnsi="Times New Roman"/>
+          <w:color w:val="1E293B"/>
+          <w:sz w:val="24"/>
+        </w:rPr>
+        <w:t>• Phase 1 (Developer Code Push): A developer commits code changes on a feature branch. Client-side Git hook hooks/commit-msg intercepts the commit to verify mandatory Change Request (CR) traceability.</w:t>
+        <w:br/>
+        <w:t>• Phase 2 (CI Pipeline &amp; Test Execution): GitHub webhooks trigger the Jenkins declarative pipeline. Apache Maven compiles Java classes and executes JUnit 5 Surefire automated unit tests.</w:t>
+        <w:br/>
+        <w:t>• Phase 3 (Build Failure Interception): When a test assertion or compilation error occurs (e.g. Build #128), Jenkins post-build steps intercept the failure exit code and archive console output and Surefire XML reports.</w:t>
+        <w:br/>
+        <w:t>• Phase 4 (Log Parsing &amp; Error Signature Extraction): CommitSleuth's log ingestion engine parses stack traces, extracting the exact failing class (ReportServiceTest), method, assertion delta, and candidate commit batch.</w:t>
+        <w:br/>
+        <w:t>• Phase 5 (Multi-Factor Blame Attribution): The heuristic engine evaluates candidate commits across four factors (File Matching 55%, Dependency Changes 25%, Commit Recency 10%, Change Size 10%), calculating a Bayesian blame attribution score.</w:t>
+        <w:br/>
+        <w:t>• Phase 6 (SCM Incident Record &amp; Alert Dispatch): The system creates a formal problem record (BUG-024) in the database and dispatches instant notifications to the web portal, email, and notification bus.</w:t>
+        <w:br/>
+        <w:t>• Phase 7 (Developer Diagnostic Portal): The responsible developer navigates to the failure dashboard (/failures/128) to inspect syntax-highlighted console logs, culprit diffs, and recommended one-click code fixes.</w:t>
+        <w:br/>
+        <w:t>• Phase 8 (Bugfix Checkout &amp; Verification Re-test): The developer creates an isolated bugfix branch, implements the approved corrective commit (referencing CR-010), and triggers automated verification Build #129.</w:t>
+        <w:br/>
+        <w:t>• Phase 9 (Verification &amp; Promotional Gate): Upon clean compilation and 100% test pass, BUG-024 is automatically transitioned to RESOLVED. SCM promotion gates verify audit checklists and authorize baseline advancement to Production (BL-05).</w:t>
+      </w:r>
+    </w:p>
+    <w:p>
+      <w:pPr>
+        <w:keepNext/>
+        <w:spacing w:before="160" w:after="80"/>
+        <w:jc w:val="center"/>
+      </w:pPr>
+      <w:r>
+        <w:drawing>
+          <wp:inline xmlns:a="http://schemas.openxmlformats.org/drawingml/2006/main" xmlns:pic="http://schemas.openxmlformats.org/drawingml/2006/picture">
+            <wp:extent cx="5486400" cy="3550024"/>
+            <wp:docPr id="2" name="Picture 2"/>
+            <wp:cNvGraphicFramePr>
+              <a:graphicFrameLocks noChangeAspect="1"/>
+            </wp:cNvGraphicFramePr>
+            <a:graphic>
+              <a:graphicData uri="http://schemas.openxmlformats.org/drawingml/2006/picture">
+                <pic:pic>
+                  <pic:nvPicPr>
+                    <pic:cNvPr id="0" name="git_07_failure_tracking_roadmap.png"/>
+                    <pic:cNvPicPr/>
+                  </pic:nvPicPr>
+                  <pic:blipFill>
+                    <a:blip r:embed="rId11"/>
+                    <a:stretch>
+                      <a:fillRect/>
+                    </a:stretch>
+                  </pic:blipFill>
+                  <pic:spPr>
+                    <a:xfrm>
+                      <a:off x="0" y="0"/>
+                      <a:ext cx="5486400" cy="3550024"/>
+                    </a:xfrm>
+                    <a:prstGeom prst="rect"/>
+                  </pic:spPr>
+                </pic:pic>
+              </a:graphicData>
+            </a:graphic>
+          </wp:inline>
+        </w:drawing>
+      </w:r>
+    </w:p>
+    <w:p>
+      <w:pPr>
+        <w:keepNext/>
+        <w:spacing w:before="40" w:after="120"/>
+        <w:jc w:val="center"/>
+      </w:pPr>
+      <w:r>
+        <w:rPr>
+          <w:rFonts w:ascii="Times New Roman" w:hAnsi="Times New Roman"/>
+          <w:b/>
+          <w:i/>
+          <w:color w:val="334155"/>
+          <w:sz w:val="21"/>
+        </w:rPr>
+        <w:t>Figure 2: CommitSleuth Build Failure Tracking &amp; Root-Cause Resolution Roadmap</w:t>
+      </w:r>
+    </w:p>
+    <w:p>
+      <w:pPr>
+        <w:spacing w:line="324" w:lineRule="auto" w:after="200"/>
+        <w:jc w:val="both"/>
+      </w:pPr>
+      <w:r>
+        <w:rPr>
+          <w:rFonts w:ascii="Times New Roman" w:hAnsi="Times New Roman"/>
+          <w:b/>
+          <w:color w:val="0F172A"/>
+          <w:sz w:val="24"/>
+        </w:rPr>
+        <w:t xml:space="preserve">Figure 2 Explanation: </w:t>
+      </w:r>
+      <w:r>
+        <w:rPr>
+          <w:rFonts w:ascii="Times New Roman" w:hAnsi="Times New Roman"/>
+          <w:color w:val="1E293B"/>
+          <w:sz w:val="24"/>
+        </w:rPr>
+        <w:t>The Failure Tracking Roadmap diagram illustrates the comprehensive 9-stage operational lifecycle implemented in CommitSleuth. It maps how code transitions from local developer commits through automated CI execution, failure capture, heuristic blame attribution (88.5% confidence for BUG-024), real-time alerts, developer root-cause diagnosis, verified corrective commits (Build #129), and formal SCM promotional gate clearance.</w:t>
+      </w:r>
+    </w:p>
+    <w:p>
+      <w:pPr>
+        <w:keepNext/>
+        <w:spacing w:before="160" w:after="80"/>
+        <w:jc w:val="center"/>
+      </w:pPr>
+      <w:r>
+        <w:drawing>
+          <wp:inline xmlns:a="http://schemas.openxmlformats.org/drawingml/2006/main" xmlns:pic="http://schemas.openxmlformats.org/drawingml/2006/picture">
+            <wp:extent cx="5486400" cy="3114278"/>
+            <wp:docPr id="3" name="Picture 3"/>
+            <wp:cNvGraphicFramePr>
+              <a:graphicFrameLocks noChangeAspect="1"/>
+            </wp:cNvGraphicFramePr>
+            <a:graphic>
+              <a:graphicData uri="http://schemas.openxmlformats.org/drawingml/2006/picture">
+                <pic:pic>
+                  <pic:nvPicPr>
+                    <pic:cNvPr id="0" name="fig01_dashboard.png"/>
+                    <pic:cNvPicPr/>
+                  </pic:nvPicPr>
+                  <pic:blipFill>
+                    <a:blip r:embed="rId12"/>
+                    <a:stretch>
+                      <a:fillRect/>
+                    </a:stretch>
+                  </pic:blipFill>
+                  <pic:spPr>
+                    <a:xfrm>
+                      <a:off x="0" y="0"/>
+                      <a:ext cx="5486400" cy="3114278"/>
+                    </a:xfrm>
+                    <a:prstGeom prst="rect"/>
+                  </pic:spPr>
+                </pic:pic>
+              </a:graphicData>
+            </a:graphic>
+          </wp:inline>
+        </w:drawing>
+      </w:r>
+    </w:p>
+    <w:p>
+      <w:pPr>
+        <w:keepNext/>
+        <w:spacing w:before="40" w:after="120"/>
+        <w:jc w:val="center"/>
+      </w:pPr>
+      <w:r>
+        <w:rPr>
+          <w:rFonts w:ascii="Times New Roman" w:hAnsi="Times New Roman"/>
+          <w:b/>
+          <w:i/>
+          <w:color w:val="334155"/>
+          <w:sz w:val="21"/>
+        </w:rPr>
+        <w:t>Figure 3: CommitSleuth Executive SCM Web Dashboard</w:t>
+      </w:r>
+    </w:p>
+    <w:p>
+      <w:pPr>
+        <w:spacing w:line="324" w:lineRule="auto" w:after="200"/>
+        <w:jc w:val="both"/>
+      </w:pPr>
+      <w:r>
+        <w:rPr>
+          <w:rFonts w:ascii="Times New Roman" w:hAnsi="Times New Roman"/>
+          <w:b/>
+          <w:color w:val="0F172A"/>
+          <w:sz w:val="24"/>
+        </w:rPr>
+        <w:t xml:space="preserve">Figure 3 Explanation: </w:t>
+      </w:r>
+      <w:r>
+        <w:rPr>
+          <w:rFonts w:ascii="Times New Roman" w:hAnsi="Times New Roman"/>
+          <w:color w:val="1E293B"/>
+          <w:sz w:val="24"/>
+        </w:rPr>
         <w:t>The Executive SCM Dashboard provides an integrated high-level view of continuous integration pipeline health, displaying calculated metrics such as total builds, build success rate (77.8%), open problem records, and unread alerts. It includes interactive visualizations of 30-day build trends, build status across the four TechNova modules, a collaborative developer activity panel, and recent pipeline executions.</w:t>
       </w:r>
     </w:p>
     <w:p>
       <w:pPr>
         <w:keepNext/>
-        <w:spacing w:before="320" w:after="120"/>
+        <w:spacing w:before="360" w:after="120"/>
       </w:pPr>
       <w:r>
         <w:rPr>
@@ -701,8 +936,8 @@
       <w:r>
         <w:drawing>
           <wp:inline xmlns:a="http://schemas.openxmlformats.org/drawingml/2006/main" xmlns:pic="http://schemas.openxmlformats.org/drawingml/2006/picture">
-            <wp:extent cx="5440680" cy="3088325"/>
-            <wp:docPr id="2" name="Picture 2"/>
+            <wp:extent cx="5486400" cy="3550024"/>
+            <wp:docPr id="4" name="Picture 4"/>
             <wp:cNvGraphicFramePr>
               <a:graphicFrameLocks noChangeAspect="1"/>
             </wp:cNvGraphicFramePr>
@@ -710,11 +945,11 @@
               <a:graphicData uri="http://schemas.openxmlformats.org/drawingml/2006/picture">
                 <pic:pic>
                   <pic:nvPicPr>
-                    <pic:cNvPr id="0" name="fig07_baselines_versions.png"/>
+                    <pic:cNvPr id="0" name="git_02_commit_history.png"/>
                     <pic:cNvPicPr/>
                   </pic:nvPicPr>
                   <pic:blipFill>
-                    <a:blip r:embed="rId11"/>
+                    <a:blip r:embed="rId13"/>
                     <a:stretch>
                       <a:fillRect/>
                     </a:stretch>
@@ -722,7 +957,7 @@
                   <pic:spPr>
                     <a:xfrm>
                       <a:off x="0" y="0"/>
-                      <a:ext cx="5440680" cy="3088325"/>
+                      <a:ext cx="5486400" cy="3550024"/>
                     </a:xfrm>
                     <a:prstGeom prst="rect"/>
                   </pic:spPr>
@@ -747,7 +982,7 @@
           <w:color w:val="334155"/>
           <w:sz w:val="21"/>
         </w:rPr>
-        <w:t>Figure 2: Baselines and Version Management Register</w:t>
+        <w:t>Figure 4: Git Commit History &amp; SCM Change Traceability Log</w:t>
       </w:r>
     </w:p>
     <w:p>
@@ -762,7 +997,7 @@
           <w:color w:val="0F172A"/>
           <w:sz w:val="24"/>
         </w:rPr>
-        <w:t xml:space="preserve">Figure 2 Explanation: </w:t>
+        <w:t xml:space="preserve">Figure 4 Explanation: </w:t>
       </w:r>
       <w:r>
         <w:rPr>
@@ -770,13 +1005,3026 @@
           <w:color w:val="1E293B"/>
           <w:sz w:val="24"/>
         </w:rPr>
-        <w:t>The Baselines and Version Management interface displays approved configuration baselines (BL-01 through BL-05), their corresponding semantic version identifiers, Git release tags, commit hashes, approval dates, and baseline comparison tools that show configuration item deltas between historical and release baselines.</w:t>
+        <w:t>The Git Commit History log demonstrates strict SCM traceability across the project lifecycle. Each commit displays verified cryptographic commit hashes (70d43eb, fa4b2c5, 11b38f4, etc.), author signatures for Prakash Raj U and Bharathwaraj K S, timestamps, and mandatory CR-xxx prefixes validated by git hooks, alongside terminal git log output showing branch decorations and merge parents.</w:t>
       </w:r>
     </w:p>
     <w:p>
       <w:pPr>
         <w:keepNext/>
-        <w:spacing w:before="320" w:after="120"/>
+        <w:spacing w:before="240" w:after="80"/>
+      </w:pPr>
+      <w:r>
+        <w:rPr>
+          <w:rFonts w:ascii="Times New Roman" w:hAnsi="Times New Roman"/>
+          <w:b/>
+          <w:color w:val="1E293B"/>
+          <w:sz w:val="25"/>
+        </w:rPr>
+        <w:t>3.1 Team Developer Commit Traceability Tabulation</w:t>
+      </w:r>
+    </w:p>
+    <w:p>
+      <w:pPr>
+        <w:spacing w:line="324" w:lineRule="auto" w:after="120"/>
+        <w:jc w:val="both"/>
+      </w:pPr>
+      <w:r>
+        <w:rPr>
+          <w:rFonts w:ascii="Times New Roman" w:hAnsi="Times New Roman"/>
+          <w:color w:val="1E293B"/>
+          <w:sz w:val="24"/>
+        </w:rPr>
+        <w:t>The following tabulation records the complete, verified commit ledger of the CommitSleuth project. It maps individual developer commits directly to calendar dates, project authors, formal Change Requests (CR-001 through CR-016), Configuration Baselines (BL-01 through BL-05), and affected Configuration Items (CIs), providing 100% bidirectional traceability between requirements, code modifications, and release artifacts:</w:t>
+      </w:r>
+    </w:p>
+    <w:tbl>
+      <w:tblPr>
+        <w:tblW w:type="auto" w:w="0"/>
+        <w:jc w:val="center"/>
+        <w:tblLook w:firstColumn="1" w:firstRow="1" w:lastColumn="0" w:lastRow="0" w:noHBand="0" w:noVBand="1" w:val="04A0"/>
+        <w:tblBorders>
+          <w:top w:val="single" w:sz="4" w:space="0" w:color="B4C6E7"/>
+          <w:left w:val="single" w:sz="4" w:space="0" w:color="B4C6E7"/>
+          <w:bottom w:val="single" w:sz="4" w:space="0" w:color="B4C6E7"/>
+          <w:right w:val="single" w:sz="4" w:space="0" w:color="B4C6E7"/>
+          <w:insideH w:val="single" w:sz="4" w:space="0" w:color="B4C6E7"/>
+          <w:insideV w:val="single" w:sz="4" w:space="0" w:color="B4C6E7"/>
+        </w:tblBorders>
+      </w:tblPr>
+      <w:tblGrid>
+        <w:gridCol w:w="1806"/>
+        <w:gridCol w:w="1806"/>
+        <w:gridCol w:w="1806"/>
+        <w:gridCol w:w="1806"/>
+        <w:gridCol w:w="1806"/>
+      </w:tblGrid>
+      <w:tr>
+        <w:tc>
+          <w:tcPr>
+            <w:tcW w:type="dxa" w:w="1440"/>
+            <w:tcMar>
+              <w:top w:w="80" w:type="dxa"/>
+              <w:bottom w:w="80" w:type="dxa"/>
+              <w:left w:w="100" w:type="dxa"/>
+              <w:right w:w="100" w:type="dxa"/>
+            </w:tcMar>
+            <w:shd w:val="clear" w:color="auto" w:fill="D9E1F2"/>
+          </w:tcPr>
+          <w:p>
+            <w:pPr>
+              <w:jc w:val="left"/>
+            </w:pPr>
+            <w:r>
+              <w:rPr>
+                <w:rFonts w:ascii="Times New Roman" w:hAnsi="Times New Roman"/>
+                <w:b/>
+                <w:color w:val="000000"/>
+                <w:sz w:val="21"/>
+              </w:rPr>
+              <w:t>Commit</w:t>
+            </w:r>
+          </w:p>
+        </w:tc>
+        <w:tc>
+          <w:tcPr>
+            <w:tcW w:type="dxa" w:w="1440"/>
+            <w:tcMar>
+              <w:top w:w="80" w:type="dxa"/>
+              <w:bottom w:w="80" w:type="dxa"/>
+              <w:left w:w="100" w:type="dxa"/>
+              <w:right w:w="100" w:type="dxa"/>
+            </w:tcMar>
+            <w:shd w:val="clear" w:color="auto" w:fill="D9E1F2"/>
+          </w:tcPr>
+          <w:p>
+            <w:pPr>
+              <w:jc w:val="left"/>
+            </w:pPr>
+            <w:r>
+              <w:rPr>
+                <w:rFonts w:ascii="Times New Roman" w:hAnsi="Times New Roman"/>
+                <w:b/>
+                <w:color w:val="000000"/>
+                <w:sz w:val="21"/>
+              </w:rPr>
+              <w:t>Date</w:t>
+            </w:r>
+          </w:p>
+        </w:tc>
+        <w:tc>
+          <w:tcPr>
+            <w:tcW w:type="dxa" w:w="1872"/>
+            <w:tcMar>
+              <w:top w:w="80" w:type="dxa"/>
+              <w:bottom w:w="80" w:type="dxa"/>
+              <w:left w:w="100" w:type="dxa"/>
+              <w:right w:w="100" w:type="dxa"/>
+            </w:tcMar>
+            <w:shd w:val="clear" w:color="auto" w:fill="D9E1F2"/>
+          </w:tcPr>
+          <w:p>
+            <w:pPr>
+              <w:jc w:val="left"/>
+            </w:pPr>
+            <w:r>
+              <w:rPr>
+                <w:rFonts w:ascii="Times New Roman" w:hAnsi="Times New Roman"/>
+                <w:b/>
+                <w:color w:val="000000"/>
+                <w:sz w:val="21"/>
+              </w:rPr>
+              <w:t>Author</w:t>
+            </w:r>
+          </w:p>
+        </w:tc>
+        <w:tc>
+          <w:tcPr>
+            <w:tcW w:type="dxa" w:w="3312"/>
+            <w:tcMar>
+              <w:top w:w="80" w:type="dxa"/>
+              <w:bottom w:w="80" w:type="dxa"/>
+              <w:left w:w="100" w:type="dxa"/>
+              <w:right w:w="100" w:type="dxa"/>
+            </w:tcMar>
+            <w:shd w:val="clear" w:color="auto" w:fill="D9E1F2"/>
+          </w:tcPr>
+          <w:p>
+            <w:pPr>
+              <w:jc w:val="left"/>
+            </w:pPr>
+            <w:r>
+              <w:rPr>
+                <w:rFonts w:ascii="Times New Roman" w:hAnsi="Times New Roman"/>
+                <w:b/>
+                <w:color w:val="000000"/>
+                <w:sz w:val="21"/>
+              </w:rPr>
+              <w:t>Commit Message &amp; SCM Association</w:t>
+            </w:r>
+          </w:p>
+        </w:tc>
+        <w:tc>
+          <w:tcPr>
+            <w:tcW w:type="dxa" w:w="1440"/>
+            <w:tcMar>
+              <w:top w:w="80" w:type="dxa"/>
+              <w:bottom w:w="80" w:type="dxa"/>
+              <w:left w:w="100" w:type="dxa"/>
+              <w:right w:w="100" w:type="dxa"/>
+            </w:tcMar>
+            <w:shd w:val="clear" w:color="auto" w:fill="D9E1F2"/>
+          </w:tcPr>
+          <w:p>
+            <w:pPr>
+              <w:jc w:val="left"/>
+            </w:pPr>
+            <w:r>
+              <w:rPr>
+                <w:rFonts w:ascii="Times New Roman" w:hAnsi="Times New Roman"/>
+                <w:b/>
+                <w:color w:val="000000"/>
+                <w:sz w:val="21"/>
+              </w:rPr>
+              <w:t>Affected CI</w:t>
+            </w:r>
+          </w:p>
+        </w:tc>
+      </w:tr>
+      <w:tr>
+        <w:tc>
+          <w:tcPr>
+            <w:tcW w:type="dxa" w:w="1440"/>
+            <w:tcMar>
+              <w:top w:w="60" w:type="dxa"/>
+              <w:bottom w:w="60" w:type="dxa"/>
+              <w:left w:w="90" w:type="dxa"/>
+              <w:right w:w="90" w:type="dxa"/>
+            </w:tcMar>
+            <w:shd w:val="clear" w:color="auto" w:fill="FFFFFF"/>
+          </w:tcPr>
+          <w:p>
+            <w:pPr>
+              <w:spacing w:line="276" w:lineRule="auto"/>
+              <w:jc w:val="left"/>
+            </w:pPr>
+            <w:r>
+              <w:rPr>
+                <w:rFonts w:ascii="Consolas" w:hAnsi="Consolas"/>
+                <w:b/>
+                <w:color w:val="0F172A"/>
+                <w:sz w:val="19"/>
+              </w:rPr>
+              <w:t>a7b2a71</w:t>
+            </w:r>
+          </w:p>
+        </w:tc>
+        <w:tc>
+          <w:tcPr>
+            <w:tcW w:type="dxa" w:w="1440"/>
+            <w:tcMar>
+              <w:top w:w="60" w:type="dxa"/>
+              <w:bottom w:w="60" w:type="dxa"/>
+              <w:left w:w="90" w:type="dxa"/>
+              <w:right w:w="90" w:type="dxa"/>
+            </w:tcMar>
+            <w:shd w:val="clear" w:color="auto" w:fill="FFFFFF"/>
+          </w:tcPr>
+          <w:p>
+            <w:pPr>
+              <w:spacing w:line="276" w:lineRule="auto"/>
+              <w:jc w:val="left"/>
+            </w:pPr>
+            <w:r>
+              <w:rPr>
+                <w:rFonts w:ascii="Times New Roman" w:hAnsi="Times New Roman"/>
+                <w:color w:val="1E293B"/>
+                <w:sz w:val="19"/>
+              </w:rPr>
+              <w:t>2026-10-05</w:t>
+            </w:r>
+          </w:p>
+        </w:tc>
+        <w:tc>
+          <w:tcPr>
+            <w:tcW w:type="dxa" w:w="1872"/>
+            <w:tcMar>
+              <w:top w:w="60" w:type="dxa"/>
+              <w:bottom w:w="60" w:type="dxa"/>
+              <w:left w:w="90" w:type="dxa"/>
+              <w:right w:w="90" w:type="dxa"/>
+            </w:tcMar>
+            <w:shd w:val="clear" w:color="auto" w:fill="FFFFFF"/>
+          </w:tcPr>
+          <w:p>
+            <w:pPr>
+              <w:spacing w:line="276" w:lineRule="auto"/>
+              <w:jc w:val="left"/>
+            </w:pPr>
+            <w:r>
+              <w:rPr>
+                <w:rFonts w:ascii="Times New Roman" w:hAnsi="Times New Roman"/>
+                <w:b/>
+                <w:color w:val="1E293B"/>
+                <w:sz w:val="19"/>
+              </w:rPr>
+              <w:t>Prakash Raj U</w:t>
+            </w:r>
+          </w:p>
+        </w:tc>
+        <w:tc>
+          <w:tcPr>
+            <w:tcW w:type="dxa" w:w="3312"/>
+            <w:tcMar>
+              <w:top w:w="60" w:type="dxa"/>
+              <w:bottom w:w="60" w:type="dxa"/>
+              <w:left w:w="90" w:type="dxa"/>
+              <w:right w:w="90" w:type="dxa"/>
+            </w:tcMar>
+            <w:shd w:val="clear" w:color="auto" w:fill="FFFFFF"/>
+          </w:tcPr>
+          <w:p>
+            <w:pPr>
+              <w:spacing w:line="276" w:lineRule="auto"/>
+              <w:jc w:val="left"/>
+            </w:pPr>
+            <w:r>
+              <w:rPr>
+                <w:rFonts w:ascii="Times New Roman" w:hAnsi="Times New Roman"/>
+                <w:color w:val="1E293B"/>
+                <w:sz w:val="19"/>
+              </w:rPr>
+              <w:t>docs(ci-01, ci-02): initialize requirements, SCM plan &amp; directory structure [Requirements Baseline]</w:t>
+            </w:r>
+          </w:p>
+        </w:tc>
+        <w:tc>
+          <w:tcPr>
+            <w:tcW w:type="dxa" w:w="1440"/>
+            <w:tcMar>
+              <w:top w:w="60" w:type="dxa"/>
+              <w:bottom w:w="60" w:type="dxa"/>
+              <w:left w:w="90" w:type="dxa"/>
+              <w:right w:w="90" w:type="dxa"/>
+            </w:tcMar>
+            <w:shd w:val="clear" w:color="auto" w:fill="FFFFFF"/>
+          </w:tcPr>
+          <w:p>
+            <w:pPr>
+              <w:spacing w:line="276" w:lineRule="auto"/>
+              <w:jc w:val="left"/>
+            </w:pPr>
+            <w:r>
+              <w:rPr>
+                <w:rFonts w:ascii="Times New Roman" w:hAnsi="Times New Roman"/>
+                <w:color w:val="1E293B"/>
+                <w:sz w:val="19"/>
+              </w:rPr>
+              <w:t>CI-01, CI-02</w:t>
+            </w:r>
+          </w:p>
+        </w:tc>
+      </w:tr>
+      <w:tr>
+        <w:tc>
+          <w:tcPr>
+            <w:tcW w:type="dxa" w:w="1440"/>
+            <w:tcMar>
+              <w:top w:w="60" w:type="dxa"/>
+              <w:bottom w:w="60" w:type="dxa"/>
+              <w:left w:w="90" w:type="dxa"/>
+              <w:right w:w="90" w:type="dxa"/>
+            </w:tcMar>
+            <w:shd w:val="clear" w:color="auto" w:fill="F8FAFC"/>
+          </w:tcPr>
+          <w:p>
+            <w:pPr>
+              <w:spacing w:line="276" w:lineRule="auto"/>
+              <w:jc w:val="left"/>
+            </w:pPr>
+            <w:r>
+              <w:rPr>
+                <w:rFonts w:ascii="Consolas" w:hAnsi="Consolas"/>
+                <w:b/>
+                <w:color w:val="0F172A"/>
+                <w:sz w:val="19"/>
+              </w:rPr>
+              <w:t>99bbeb5</w:t>
+            </w:r>
+          </w:p>
+        </w:tc>
+        <w:tc>
+          <w:tcPr>
+            <w:tcW w:type="dxa" w:w="1440"/>
+            <w:tcMar>
+              <w:top w:w="60" w:type="dxa"/>
+              <w:bottom w:w="60" w:type="dxa"/>
+              <w:left w:w="90" w:type="dxa"/>
+              <w:right w:w="90" w:type="dxa"/>
+            </w:tcMar>
+            <w:shd w:val="clear" w:color="auto" w:fill="F8FAFC"/>
+          </w:tcPr>
+          <w:p>
+            <w:pPr>
+              <w:spacing w:line="276" w:lineRule="auto"/>
+              <w:jc w:val="left"/>
+            </w:pPr>
+            <w:r>
+              <w:rPr>
+                <w:rFonts w:ascii="Times New Roman" w:hAnsi="Times New Roman"/>
+                <w:color w:val="1E293B"/>
+                <w:sz w:val="19"/>
+              </w:rPr>
+              <w:t>2026-10-08</w:t>
+            </w:r>
+          </w:p>
+        </w:tc>
+        <w:tc>
+          <w:tcPr>
+            <w:tcW w:type="dxa" w:w="1872"/>
+            <w:tcMar>
+              <w:top w:w="60" w:type="dxa"/>
+              <w:bottom w:w="60" w:type="dxa"/>
+              <w:left w:w="90" w:type="dxa"/>
+              <w:right w:w="90" w:type="dxa"/>
+            </w:tcMar>
+            <w:shd w:val="clear" w:color="auto" w:fill="F8FAFC"/>
+          </w:tcPr>
+          <w:p>
+            <w:pPr>
+              <w:spacing w:line="276" w:lineRule="auto"/>
+              <w:jc w:val="left"/>
+            </w:pPr>
+            <w:r>
+              <w:rPr>
+                <w:rFonts w:ascii="Times New Roman" w:hAnsi="Times New Roman"/>
+                <w:b/>
+                <w:color w:val="1E293B"/>
+                <w:sz w:val="19"/>
+              </w:rPr>
+              <w:t>Bharathwaraj K S</w:t>
+            </w:r>
+          </w:p>
+        </w:tc>
+        <w:tc>
+          <w:tcPr>
+            <w:tcW w:type="dxa" w:w="3312"/>
+            <w:tcMar>
+              <w:top w:w="60" w:type="dxa"/>
+              <w:bottom w:w="60" w:type="dxa"/>
+              <w:left w:w="90" w:type="dxa"/>
+              <w:right w:w="90" w:type="dxa"/>
+            </w:tcMar>
+            <w:shd w:val="clear" w:color="auto" w:fill="F8FAFC"/>
+          </w:tcPr>
+          <w:p>
+            <w:pPr>
+              <w:spacing w:line="276" w:lineRule="auto"/>
+              <w:jc w:val="left"/>
+            </w:pPr>
+            <w:r>
+              <w:rPr>
+                <w:rFonts w:ascii="Times New Roman" w:hAnsi="Times New Roman"/>
+                <w:color w:val="1E293B"/>
+                <w:sz w:val="19"/>
+              </w:rPr>
+              <w:t>design(ci-03, ci-04): establish heuristic blame scoring weights &amp; database schema [Design Baseline]</w:t>
+            </w:r>
+          </w:p>
+        </w:tc>
+        <w:tc>
+          <w:tcPr>
+            <w:tcW w:type="dxa" w:w="1440"/>
+            <w:tcMar>
+              <w:top w:w="60" w:type="dxa"/>
+              <w:bottom w:w="60" w:type="dxa"/>
+              <w:left w:w="90" w:type="dxa"/>
+              <w:right w:w="90" w:type="dxa"/>
+            </w:tcMar>
+            <w:shd w:val="clear" w:color="auto" w:fill="F8FAFC"/>
+          </w:tcPr>
+          <w:p>
+            <w:pPr>
+              <w:spacing w:line="276" w:lineRule="auto"/>
+              <w:jc w:val="left"/>
+            </w:pPr>
+            <w:r>
+              <w:rPr>
+                <w:rFonts w:ascii="Times New Roman" w:hAnsi="Times New Roman"/>
+                <w:color w:val="1E293B"/>
+                <w:sz w:val="19"/>
+              </w:rPr>
+              <w:t>CI-03, CI-04</w:t>
+            </w:r>
+          </w:p>
+        </w:tc>
+      </w:tr>
+      <w:tr>
+        <w:tc>
+          <w:tcPr>
+            <w:tcW w:type="dxa" w:w="1440"/>
+            <w:tcMar>
+              <w:top w:w="60" w:type="dxa"/>
+              <w:bottom w:w="60" w:type="dxa"/>
+              <w:left w:w="90" w:type="dxa"/>
+              <w:right w:w="90" w:type="dxa"/>
+            </w:tcMar>
+            <w:shd w:val="clear" w:color="auto" w:fill="FFFFFF"/>
+          </w:tcPr>
+          <w:p>
+            <w:pPr>
+              <w:spacing w:line="276" w:lineRule="auto"/>
+              <w:jc w:val="left"/>
+            </w:pPr>
+            <w:r>
+              <w:rPr>
+                <w:rFonts w:ascii="Consolas" w:hAnsi="Consolas"/>
+                <w:b/>
+                <w:color w:val="0F172A"/>
+                <w:sz w:val="19"/>
+              </w:rPr>
+              <w:t>f0ad7d0</w:t>
+            </w:r>
+          </w:p>
+        </w:tc>
+        <w:tc>
+          <w:tcPr>
+            <w:tcW w:type="dxa" w:w="1440"/>
+            <w:tcMar>
+              <w:top w:w="60" w:type="dxa"/>
+              <w:bottom w:w="60" w:type="dxa"/>
+              <w:left w:w="90" w:type="dxa"/>
+              <w:right w:w="90" w:type="dxa"/>
+            </w:tcMar>
+            <w:shd w:val="clear" w:color="auto" w:fill="FFFFFF"/>
+          </w:tcPr>
+          <w:p>
+            <w:pPr>
+              <w:spacing w:line="276" w:lineRule="auto"/>
+              <w:jc w:val="left"/>
+            </w:pPr>
+            <w:r>
+              <w:rPr>
+                <w:rFonts w:ascii="Times New Roman" w:hAnsi="Times New Roman"/>
+                <w:color w:val="1E293B"/>
+                <w:sz w:val="19"/>
+              </w:rPr>
+              <w:t>2026-10-10</w:t>
+            </w:r>
+          </w:p>
+        </w:tc>
+        <w:tc>
+          <w:tcPr>
+            <w:tcW w:type="dxa" w:w="1872"/>
+            <w:tcMar>
+              <w:top w:w="60" w:type="dxa"/>
+              <w:bottom w:w="60" w:type="dxa"/>
+              <w:left w:w="90" w:type="dxa"/>
+              <w:right w:w="90" w:type="dxa"/>
+            </w:tcMar>
+            <w:shd w:val="clear" w:color="auto" w:fill="FFFFFF"/>
+          </w:tcPr>
+          <w:p>
+            <w:pPr>
+              <w:spacing w:line="276" w:lineRule="auto"/>
+              <w:jc w:val="left"/>
+            </w:pPr>
+            <w:r>
+              <w:rPr>
+                <w:rFonts w:ascii="Times New Roman" w:hAnsi="Times New Roman"/>
+                <w:b/>
+                <w:color w:val="1E293B"/>
+                <w:sz w:val="19"/>
+              </w:rPr>
+              <w:t>Prakash Raj U</w:t>
+            </w:r>
+          </w:p>
+        </w:tc>
+        <w:tc>
+          <w:tcPr>
+            <w:tcW w:type="dxa" w:w="3312"/>
+            <w:tcMar>
+              <w:top w:w="60" w:type="dxa"/>
+              <w:bottom w:w="60" w:type="dxa"/>
+              <w:left w:w="90" w:type="dxa"/>
+              <w:right w:w="90" w:type="dxa"/>
+            </w:tcMar>
+            <w:shd w:val="clear" w:color="auto" w:fill="FFFFFF"/>
+          </w:tcPr>
+          <w:p>
+            <w:pPr>
+              <w:spacing w:line="276" w:lineRule="auto"/>
+              <w:jc w:val="left"/>
+            </w:pPr>
+            <w:r>
+              <w:rPr>
+                <w:rFonts w:ascii="Times New Roman" w:hAnsi="Times New Roman"/>
+                <w:color w:val="1E293B"/>
+                <w:sz w:val="19"/>
+              </w:rPr>
+              <w:t>Merge pull request #1 from feature/scoring-config: implement YAML configuration [Baseline BL-04]</w:t>
+            </w:r>
+          </w:p>
+        </w:tc>
+        <w:tc>
+          <w:tcPr>
+            <w:tcW w:type="dxa" w:w="1440"/>
+            <w:tcMar>
+              <w:top w:w="60" w:type="dxa"/>
+              <w:bottom w:w="60" w:type="dxa"/>
+              <w:left w:w="90" w:type="dxa"/>
+              <w:right w:w="90" w:type="dxa"/>
+            </w:tcMar>
+            <w:shd w:val="clear" w:color="auto" w:fill="FFFFFF"/>
+          </w:tcPr>
+          <w:p>
+            <w:pPr>
+              <w:spacing w:line="276" w:lineRule="auto"/>
+              <w:jc w:val="left"/>
+            </w:pPr>
+            <w:r>
+              <w:rPr>
+                <w:rFonts w:ascii="Times New Roman" w:hAnsi="Times New Roman"/>
+                <w:color w:val="1E293B"/>
+                <w:sz w:val="19"/>
+              </w:rPr>
+              <w:t>CI-03, CI-05</w:t>
+            </w:r>
+          </w:p>
+        </w:tc>
+      </w:tr>
+      <w:tr>
+        <w:tc>
+          <w:tcPr>
+            <w:tcW w:type="dxa" w:w="1440"/>
+            <w:tcMar>
+              <w:top w:w="60" w:type="dxa"/>
+              <w:bottom w:w="60" w:type="dxa"/>
+              <w:left w:w="90" w:type="dxa"/>
+              <w:right w:w="90" w:type="dxa"/>
+            </w:tcMar>
+            <w:shd w:val="clear" w:color="auto" w:fill="F8FAFC"/>
+          </w:tcPr>
+          <w:p>
+            <w:pPr>
+              <w:spacing w:line="276" w:lineRule="auto"/>
+              <w:jc w:val="left"/>
+            </w:pPr>
+            <w:r>
+              <w:rPr>
+                <w:rFonts w:ascii="Consolas" w:hAnsi="Consolas"/>
+                <w:b/>
+                <w:color w:val="0F172A"/>
+                <w:sz w:val="19"/>
+              </w:rPr>
+              <w:t>f1127d0</w:t>
+            </w:r>
+          </w:p>
+        </w:tc>
+        <w:tc>
+          <w:tcPr>
+            <w:tcW w:type="dxa" w:w="1440"/>
+            <w:tcMar>
+              <w:top w:w="60" w:type="dxa"/>
+              <w:bottom w:w="60" w:type="dxa"/>
+              <w:left w:w="90" w:type="dxa"/>
+              <w:right w:w="90" w:type="dxa"/>
+            </w:tcMar>
+            <w:shd w:val="clear" w:color="auto" w:fill="F8FAFC"/>
+          </w:tcPr>
+          <w:p>
+            <w:pPr>
+              <w:spacing w:line="276" w:lineRule="auto"/>
+              <w:jc w:val="left"/>
+            </w:pPr>
+            <w:r>
+              <w:rPr>
+                <w:rFonts w:ascii="Times New Roman" w:hAnsi="Times New Roman"/>
+                <w:color w:val="1E293B"/>
+                <w:sz w:val="19"/>
+              </w:rPr>
+              <w:t>2026-10-12</w:t>
+            </w:r>
+          </w:p>
+        </w:tc>
+        <w:tc>
+          <w:tcPr>
+            <w:tcW w:type="dxa" w:w="1872"/>
+            <w:tcMar>
+              <w:top w:w="60" w:type="dxa"/>
+              <w:bottom w:w="60" w:type="dxa"/>
+              <w:left w:w="90" w:type="dxa"/>
+              <w:right w:w="90" w:type="dxa"/>
+            </w:tcMar>
+            <w:shd w:val="clear" w:color="auto" w:fill="F8FAFC"/>
+          </w:tcPr>
+          <w:p>
+            <w:pPr>
+              <w:spacing w:line="276" w:lineRule="auto"/>
+              <w:jc w:val="left"/>
+            </w:pPr>
+            <w:r>
+              <w:rPr>
+                <w:rFonts w:ascii="Times New Roman" w:hAnsi="Times New Roman"/>
+                <w:b/>
+                <w:color w:val="1E293B"/>
+                <w:sz w:val="19"/>
+              </w:rPr>
+              <w:t>Bharathwaraj K S</w:t>
+            </w:r>
+          </w:p>
+        </w:tc>
+        <w:tc>
+          <w:tcPr>
+            <w:tcW w:type="dxa" w:w="3312"/>
+            <w:tcMar>
+              <w:top w:w="60" w:type="dxa"/>
+              <w:bottom w:w="60" w:type="dxa"/>
+              <w:left w:w="90" w:type="dxa"/>
+              <w:right w:w="90" w:type="dxa"/>
+            </w:tcMar>
+            <w:shd w:val="clear" w:color="auto" w:fill="F8FAFC"/>
+          </w:tcPr>
+          <w:p>
+            <w:pPr>
+              <w:spacing w:line="276" w:lineRule="auto"/>
+              <w:jc w:val="left"/>
+            </w:pPr>
+            <w:r>
+              <w:rPr>
+                <w:rFonts w:ascii="Times New Roman" w:hAnsi="Times New Roman"/>
+                <w:color w:val="1E293B"/>
+                <w:sz w:val="19"/>
+              </w:rPr>
+              <w:t>feat(ci-05): implement executive SCM dashboard &amp; build recorder controller [CR-002]</w:t>
+            </w:r>
+          </w:p>
+        </w:tc>
+        <w:tc>
+          <w:tcPr>
+            <w:tcW w:type="dxa" w:w="1440"/>
+            <w:tcMar>
+              <w:top w:w="60" w:type="dxa"/>
+              <w:bottom w:w="60" w:type="dxa"/>
+              <w:left w:w="90" w:type="dxa"/>
+              <w:right w:w="90" w:type="dxa"/>
+            </w:tcMar>
+            <w:shd w:val="clear" w:color="auto" w:fill="F8FAFC"/>
+          </w:tcPr>
+          <w:p>
+            <w:pPr>
+              <w:spacing w:line="276" w:lineRule="auto"/>
+              <w:jc w:val="left"/>
+            </w:pPr>
+            <w:r>
+              <w:rPr>
+                <w:rFonts w:ascii="Times New Roman" w:hAnsi="Times New Roman"/>
+                <w:color w:val="1E293B"/>
+                <w:sz w:val="19"/>
+              </w:rPr>
+              <w:t>CI-05</w:t>
+            </w:r>
+          </w:p>
+        </w:tc>
+      </w:tr>
+      <w:tr>
+        <w:tc>
+          <w:tcPr>
+            <w:tcW w:type="dxa" w:w="1440"/>
+            <w:tcMar>
+              <w:top w:w="60" w:type="dxa"/>
+              <w:bottom w:w="60" w:type="dxa"/>
+              <w:left w:w="90" w:type="dxa"/>
+              <w:right w:w="90" w:type="dxa"/>
+            </w:tcMar>
+            <w:shd w:val="clear" w:color="auto" w:fill="FFFFFF"/>
+          </w:tcPr>
+          <w:p>
+            <w:pPr>
+              <w:spacing w:line="276" w:lineRule="auto"/>
+              <w:jc w:val="left"/>
+            </w:pPr>
+            <w:r>
+              <w:rPr>
+                <w:rFonts w:ascii="Consolas" w:hAnsi="Consolas"/>
+                <w:b/>
+                <w:color w:val="0F172A"/>
+                <w:sz w:val="19"/>
+              </w:rPr>
+              <w:t>9297e33</w:t>
+            </w:r>
+          </w:p>
+        </w:tc>
+        <w:tc>
+          <w:tcPr>
+            <w:tcW w:type="dxa" w:w="1440"/>
+            <w:tcMar>
+              <w:top w:w="60" w:type="dxa"/>
+              <w:bottom w:w="60" w:type="dxa"/>
+              <w:left w:w="90" w:type="dxa"/>
+              <w:right w:w="90" w:type="dxa"/>
+            </w:tcMar>
+            <w:shd w:val="clear" w:color="auto" w:fill="FFFFFF"/>
+          </w:tcPr>
+          <w:p>
+            <w:pPr>
+              <w:spacing w:line="276" w:lineRule="auto"/>
+              <w:jc w:val="left"/>
+            </w:pPr>
+            <w:r>
+              <w:rPr>
+                <w:rFonts w:ascii="Times New Roman" w:hAnsi="Times New Roman"/>
+                <w:color w:val="1E293B"/>
+                <w:sz w:val="19"/>
+              </w:rPr>
+              <w:t>2026-10-14</w:t>
+            </w:r>
+          </w:p>
+        </w:tc>
+        <w:tc>
+          <w:tcPr>
+            <w:tcW w:type="dxa" w:w="1872"/>
+            <w:tcMar>
+              <w:top w:w="60" w:type="dxa"/>
+              <w:bottom w:w="60" w:type="dxa"/>
+              <w:left w:w="90" w:type="dxa"/>
+              <w:right w:w="90" w:type="dxa"/>
+            </w:tcMar>
+            <w:shd w:val="clear" w:color="auto" w:fill="FFFFFF"/>
+          </w:tcPr>
+          <w:p>
+            <w:pPr>
+              <w:spacing w:line="276" w:lineRule="auto"/>
+              <w:jc w:val="left"/>
+            </w:pPr>
+            <w:r>
+              <w:rPr>
+                <w:rFonts w:ascii="Times New Roman" w:hAnsi="Times New Roman"/>
+                <w:b/>
+                <w:color w:val="1E293B"/>
+                <w:sz w:val="19"/>
+              </w:rPr>
+              <w:t>Prakash Raj U</w:t>
+            </w:r>
+          </w:p>
+        </w:tc>
+        <w:tc>
+          <w:tcPr>
+            <w:tcW w:type="dxa" w:w="3312"/>
+            <w:tcMar>
+              <w:top w:w="60" w:type="dxa"/>
+              <w:bottom w:w="60" w:type="dxa"/>
+              <w:left w:w="90" w:type="dxa"/>
+              <w:right w:w="90" w:type="dxa"/>
+            </w:tcMar>
+            <w:shd w:val="clear" w:color="auto" w:fill="FFFFFF"/>
+          </w:tcPr>
+          <w:p>
+            <w:pPr>
+              <w:spacing w:line="276" w:lineRule="auto"/>
+              <w:jc w:val="left"/>
+            </w:pPr>
+            <w:r>
+              <w:rPr>
+                <w:rFonts w:ascii="Times New Roman" w:hAnsi="Times New Roman"/>
+                <w:color w:val="1E293B"/>
+                <w:sz w:val="19"/>
+              </w:rPr>
+              <w:t>feat(ci-09): introduce calculation failure in Calculator add method for fault injection [CR-009]</w:t>
+            </w:r>
+          </w:p>
+        </w:tc>
+        <w:tc>
+          <w:tcPr>
+            <w:tcW w:type="dxa" w:w="1440"/>
+            <w:tcMar>
+              <w:top w:w="60" w:type="dxa"/>
+              <w:bottom w:w="60" w:type="dxa"/>
+              <w:left w:w="90" w:type="dxa"/>
+              <w:right w:w="90" w:type="dxa"/>
+            </w:tcMar>
+            <w:shd w:val="clear" w:color="auto" w:fill="FFFFFF"/>
+          </w:tcPr>
+          <w:p>
+            <w:pPr>
+              <w:spacing w:line="276" w:lineRule="auto"/>
+              <w:jc w:val="left"/>
+            </w:pPr>
+            <w:r>
+              <w:rPr>
+                <w:rFonts w:ascii="Times New Roman" w:hAnsi="Times New Roman"/>
+                <w:color w:val="1E293B"/>
+                <w:sz w:val="19"/>
+              </w:rPr>
+              <w:t>CI-09</w:t>
+            </w:r>
+          </w:p>
+        </w:tc>
+      </w:tr>
+      <w:tr>
+        <w:tc>
+          <w:tcPr>
+            <w:tcW w:type="dxa" w:w="1440"/>
+            <w:tcMar>
+              <w:top w:w="60" w:type="dxa"/>
+              <w:bottom w:w="60" w:type="dxa"/>
+              <w:left w:w="90" w:type="dxa"/>
+              <w:right w:w="90" w:type="dxa"/>
+            </w:tcMar>
+            <w:shd w:val="clear" w:color="auto" w:fill="F8FAFC"/>
+          </w:tcPr>
+          <w:p>
+            <w:pPr>
+              <w:spacing w:line="276" w:lineRule="auto"/>
+              <w:jc w:val="left"/>
+            </w:pPr>
+            <w:r>
+              <w:rPr>
+                <w:rFonts w:ascii="Consolas" w:hAnsi="Consolas"/>
+                <w:b/>
+                <w:color w:val="0F172A"/>
+                <w:sz w:val="19"/>
+              </w:rPr>
+              <w:t>63e1e5b</w:t>
+            </w:r>
+          </w:p>
+        </w:tc>
+        <w:tc>
+          <w:tcPr>
+            <w:tcW w:type="dxa" w:w="1440"/>
+            <w:tcMar>
+              <w:top w:w="60" w:type="dxa"/>
+              <w:bottom w:w="60" w:type="dxa"/>
+              <w:left w:w="90" w:type="dxa"/>
+              <w:right w:w="90" w:type="dxa"/>
+            </w:tcMar>
+            <w:shd w:val="clear" w:color="auto" w:fill="F8FAFC"/>
+          </w:tcPr>
+          <w:p>
+            <w:pPr>
+              <w:spacing w:line="276" w:lineRule="auto"/>
+              <w:jc w:val="left"/>
+            </w:pPr>
+            <w:r>
+              <w:rPr>
+                <w:rFonts w:ascii="Times New Roman" w:hAnsi="Times New Roman"/>
+                <w:color w:val="1E293B"/>
+                <w:sz w:val="19"/>
+              </w:rPr>
+              <w:t>2026-10-15</w:t>
+            </w:r>
+          </w:p>
+        </w:tc>
+        <w:tc>
+          <w:tcPr>
+            <w:tcW w:type="dxa" w:w="1872"/>
+            <w:tcMar>
+              <w:top w:w="60" w:type="dxa"/>
+              <w:bottom w:w="60" w:type="dxa"/>
+              <w:left w:w="90" w:type="dxa"/>
+              <w:right w:w="90" w:type="dxa"/>
+            </w:tcMar>
+            <w:shd w:val="clear" w:color="auto" w:fill="F8FAFC"/>
+          </w:tcPr>
+          <w:p>
+            <w:pPr>
+              <w:spacing w:line="276" w:lineRule="auto"/>
+              <w:jc w:val="left"/>
+            </w:pPr>
+            <w:r>
+              <w:rPr>
+                <w:rFonts w:ascii="Times New Roman" w:hAnsi="Times New Roman"/>
+                <w:b/>
+                <w:color w:val="1E293B"/>
+                <w:sz w:val="19"/>
+              </w:rPr>
+              <w:t>Bharathwaraj K S</w:t>
+            </w:r>
+          </w:p>
+        </w:tc>
+        <w:tc>
+          <w:tcPr>
+            <w:tcW w:type="dxa" w:w="3312"/>
+            <w:tcMar>
+              <w:top w:w="60" w:type="dxa"/>
+              <w:bottom w:w="60" w:type="dxa"/>
+              <w:left w:w="90" w:type="dxa"/>
+              <w:right w:w="90" w:type="dxa"/>
+            </w:tcMar>
+            <w:shd w:val="clear" w:color="auto" w:fill="F8FAFC"/>
+          </w:tcPr>
+          <w:p>
+            <w:pPr>
+              <w:spacing w:line="276" w:lineRule="auto"/>
+              <w:jc w:val="left"/>
+            </w:pPr>
+            <w:r>
+              <w:rPr>
+                <w:rFonts w:ascii="Times New Roman" w:hAnsi="Times New Roman"/>
+                <w:color w:val="1E293B"/>
+                <w:sz w:val="19"/>
+              </w:rPr>
+              <w:t>test(ci-06): update regression test notes &amp; automated Surefire assertion check [CR-009]</w:t>
+            </w:r>
+          </w:p>
+        </w:tc>
+        <w:tc>
+          <w:tcPr>
+            <w:tcW w:type="dxa" w:w="1440"/>
+            <w:tcMar>
+              <w:top w:w="60" w:type="dxa"/>
+              <w:bottom w:w="60" w:type="dxa"/>
+              <w:left w:w="90" w:type="dxa"/>
+              <w:right w:w="90" w:type="dxa"/>
+            </w:tcMar>
+            <w:shd w:val="clear" w:color="auto" w:fill="F8FAFC"/>
+          </w:tcPr>
+          <w:p>
+            <w:pPr>
+              <w:spacing w:line="276" w:lineRule="auto"/>
+              <w:jc w:val="left"/>
+            </w:pPr>
+            <w:r>
+              <w:rPr>
+                <w:rFonts w:ascii="Times New Roman" w:hAnsi="Times New Roman"/>
+                <w:color w:val="1E293B"/>
+                <w:sz w:val="19"/>
+              </w:rPr>
+              <w:t>CI-06</w:t>
+            </w:r>
+          </w:p>
+        </w:tc>
+      </w:tr>
+      <w:tr>
+        <w:tc>
+          <w:tcPr>
+            <w:tcW w:type="dxa" w:w="1440"/>
+            <w:tcMar>
+              <w:top w:w="60" w:type="dxa"/>
+              <w:bottom w:w="60" w:type="dxa"/>
+              <w:left w:w="90" w:type="dxa"/>
+              <w:right w:w="90" w:type="dxa"/>
+            </w:tcMar>
+            <w:shd w:val="clear" w:color="auto" w:fill="FFFFFF"/>
+          </w:tcPr>
+          <w:p>
+            <w:pPr>
+              <w:spacing w:line="276" w:lineRule="auto"/>
+              <w:jc w:val="left"/>
+            </w:pPr>
+            <w:r>
+              <w:rPr>
+                <w:rFonts w:ascii="Consolas" w:hAnsi="Consolas"/>
+                <w:b/>
+                <w:color w:val="0F172A"/>
+                <w:sz w:val="19"/>
+              </w:rPr>
+              <w:t>e789c77</w:t>
+            </w:r>
+          </w:p>
+        </w:tc>
+        <w:tc>
+          <w:tcPr>
+            <w:tcW w:type="dxa" w:w="1440"/>
+            <w:tcMar>
+              <w:top w:w="60" w:type="dxa"/>
+              <w:bottom w:w="60" w:type="dxa"/>
+              <w:left w:w="90" w:type="dxa"/>
+              <w:right w:w="90" w:type="dxa"/>
+            </w:tcMar>
+            <w:shd w:val="clear" w:color="auto" w:fill="FFFFFF"/>
+          </w:tcPr>
+          <w:p>
+            <w:pPr>
+              <w:spacing w:line="276" w:lineRule="auto"/>
+              <w:jc w:val="left"/>
+            </w:pPr>
+            <w:r>
+              <w:rPr>
+                <w:rFonts w:ascii="Times New Roman" w:hAnsi="Times New Roman"/>
+                <w:color w:val="1E293B"/>
+                <w:sz w:val="19"/>
+              </w:rPr>
+              <w:t>2026-10-16</w:t>
+            </w:r>
+          </w:p>
+        </w:tc>
+        <w:tc>
+          <w:tcPr>
+            <w:tcW w:type="dxa" w:w="1872"/>
+            <w:tcMar>
+              <w:top w:w="60" w:type="dxa"/>
+              <w:bottom w:w="60" w:type="dxa"/>
+              <w:left w:w="90" w:type="dxa"/>
+              <w:right w:w="90" w:type="dxa"/>
+            </w:tcMar>
+            <w:shd w:val="clear" w:color="auto" w:fill="FFFFFF"/>
+          </w:tcPr>
+          <w:p>
+            <w:pPr>
+              <w:spacing w:line="276" w:lineRule="auto"/>
+              <w:jc w:val="left"/>
+            </w:pPr>
+            <w:r>
+              <w:rPr>
+                <w:rFonts w:ascii="Times New Roman" w:hAnsi="Times New Roman"/>
+                <w:b/>
+                <w:color w:val="1E293B"/>
+                <w:sz w:val="19"/>
+              </w:rPr>
+              <w:t>Prakash Raj U</w:t>
+            </w:r>
+          </w:p>
+        </w:tc>
+        <w:tc>
+          <w:tcPr>
+            <w:tcW w:type="dxa" w:w="3312"/>
+            <w:tcMar>
+              <w:top w:w="60" w:type="dxa"/>
+              <w:bottom w:w="60" w:type="dxa"/>
+              <w:left w:w="90" w:type="dxa"/>
+              <w:right w:w="90" w:type="dxa"/>
+            </w:tcMar>
+            <w:shd w:val="clear" w:color="auto" w:fill="FFFFFF"/>
+          </w:tcPr>
+          <w:p>
+            <w:pPr>
+              <w:spacing w:line="276" w:lineRule="auto"/>
+              <w:jc w:val="left"/>
+            </w:pPr>
+            <w:r>
+              <w:rPr>
+                <w:rFonts w:ascii="Times New Roman" w:hAnsi="Times New Roman"/>
+                <w:color w:val="1E293B"/>
+                <w:sz w:val="19"/>
+              </w:rPr>
+              <w:t>fix(ci-09): resolve Calculator calculation defect and restore passing build [CR-009]</w:t>
+            </w:r>
+          </w:p>
+        </w:tc>
+        <w:tc>
+          <w:tcPr>
+            <w:tcW w:type="dxa" w:w="1440"/>
+            <w:tcMar>
+              <w:top w:w="60" w:type="dxa"/>
+              <w:bottom w:w="60" w:type="dxa"/>
+              <w:left w:w="90" w:type="dxa"/>
+              <w:right w:w="90" w:type="dxa"/>
+            </w:tcMar>
+            <w:shd w:val="clear" w:color="auto" w:fill="FFFFFF"/>
+          </w:tcPr>
+          <w:p>
+            <w:pPr>
+              <w:spacing w:line="276" w:lineRule="auto"/>
+              <w:jc w:val="left"/>
+            </w:pPr>
+            <w:r>
+              <w:rPr>
+                <w:rFonts w:ascii="Times New Roman" w:hAnsi="Times New Roman"/>
+                <w:color w:val="1E293B"/>
+                <w:sz w:val="19"/>
+              </w:rPr>
+              <w:t>CI-09</w:t>
+            </w:r>
+          </w:p>
+        </w:tc>
+      </w:tr>
+      <w:tr>
+        <w:tc>
+          <w:tcPr>
+            <w:tcW w:type="dxa" w:w="1440"/>
+            <w:tcMar>
+              <w:top w:w="60" w:type="dxa"/>
+              <w:bottom w:w="60" w:type="dxa"/>
+              <w:left w:w="90" w:type="dxa"/>
+              <w:right w:w="90" w:type="dxa"/>
+            </w:tcMar>
+            <w:shd w:val="clear" w:color="auto" w:fill="F8FAFC"/>
+          </w:tcPr>
+          <w:p>
+            <w:pPr>
+              <w:spacing w:line="276" w:lineRule="auto"/>
+              <w:jc w:val="left"/>
+            </w:pPr>
+            <w:r>
+              <w:rPr>
+                <w:rFonts w:ascii="Consolas" w:hAnsi="Consolas"/>
+                <w:b/>
+                <w:color w:val="0F172A"/>
+                <w:sz w:val="19"/>
+              </w:rPr>
+              <w:t>0814589</w:t>
+            </w:r>
+          </w:p>
+        </w:tc>
+        <w:tc>
+          <w:tcPr>
+            <w:tcW w:type="dxa" w:w="1440"/>
+            <w:tcMar>
+              <w:top w:w="60" w:type="dxa"/>
+              <w:bottom w:w="60" w:type="dxa"/>
+              <w:left w:w="90" w:type="dxa"/>
+              <w:right w:w="90" w:type="dxa"/>
+            </w:tcMar>
+            <w:shd w:val="clear" w:color="auto" w:fill="F8FAFC"/>
+          </w:tcPr>
+          <w:p>
+            <w:pPr>
+              <w:spacing w:line="276" w:lineRule="auto"/>
+              <w:jc w:val="left"/>
+            </w:pPr>
+            <w:r>
+              <w:rPr>
+                <w:rFonts w:ascii="Times New Roman" w:hAnsi="Times New Roman"/>
+                <w:color w:val="1E293B"/>
+                <w:sz w:val="19"/>
+              </w:rPr>
+              <w:t>2026-10-16</w:t>
+            </w:r>
+          </w:p>
+        </w:tc>
+        <w:tc>
+          <w:tcPr>
+            <w:tcW w:type="dxa" w:w="1872"/>
+            <w:tcMar>
+              <w:top w:w="60" w:type="dxa"/>
+              <w:bottom w:w="60" w:type="dxa"/>
+              <w:left w:w="90" w:type="dxa"/>
+              <w:right w:w="90" w:type="dxa"/>
+            </w:tcMar>
+            <w:shd w:val="clear" w:color="auto" w:fill="F8FAFC"/>
+          </w:tcPr>
+          <w:p>
+            <w:pPr>
+              <w:spacing w:line="276" w:lineRule="auto"/>
+              <w:jc w:val="left"/>
+            </w:pPr>
+            <w:r>
+              <w:rPr>
+                <w:rFonts w:ascii="Times New Roman" w:hAnsi="Times New Roman"/>
+                <w:b/>
+                <w:color w:val="1E293B"/>
+                <w:sz w:val="19"/>
+              </w:rPr>
+              <w:t>Bharathwaraj K S</w:t>
+            </w:r>
+          </w:p>
+        </w:tc>
+        <w:tc>
+          <w:tcPr>
+            <w:tcW w:type="dxa" w:w="3312"/>
+            <w:tcMar>
+              <w:top w:w="60" w:type="dxa"/>
+              <w:bottom w:w="60" w:type="dxa"/>
+              <w:left w:w="90" w:type="dxa"/>
+              <w:right w:w="90" w:type="dxa"/>
+            </w:tcMar>
+            <w:shd w:val="clear" w:color="auto" w:fill="F8FAFC"/>
+          </w:tcPr>
+          <w:p>
+            <w:pPr>
+              <w:spacing w:line="276" w:lineRule="auto"/>
+              <w:jc w:val="left"/>
+            </w:pPr>
+            <w:r>
+              <w:rPr>
+                <w:rFonts w:ascii="Times New Roman" w:hAnsi="Times New Roman"/>
+                <w:color w:val="1E293B"/>
+                <w:sz w:val="19"/>
+              </w:rPr>
+              <w:t>Merge pull request #2 from bugfix/demo-calc-failure: resolve defect BUG-024 (CR-009)</w:t>
+            </w:r>
+          </w:p>
+        </w:tc>
+        <w:tc>
+          <w:tcPr>
+            <w:tcW w:type="dxa" w:w="1440"/>
+            <w:tcMar>
+              <w:top w:w="60" w:type="dxa"/>
+              <w:bottom w:w="60" w:type="dxa"/>
+              <w:left w:w="90" w:type="dxa"/>
+              <w:right w:w="90" w:type="dxa"/>
+            </w:tcMar>
+            <w:shd w:val="clear" w:color="auto" w:fill="F8FAFC"/>
+          </w:tcPr>
+          <w:p>
+            <w:pPr>
+              <w:spacing w:line="276" w:lineRule="auto"/>
+              <w:jc w:val="left"/>
+            </w:pPr>
+            <w:r>
+              <w:rPr>
+                <w:rFonts w:ascii="Times New Roman" w:hAnsi="Times New Roman"/>
+                <w:color w:val="1E293B"/>
+                <w:sz w:val="19"/>
+              </w:rPr>
+              <w:t>CI-06, CI-09</w:t>
+            </w:r>
+          </w:p>
+        </w:tc>
+      </w:tr>
+      <w:tr>
+        <w:tc>
+          <w:tcPr>
+            <w:tcW w:type="dxa" w:w="1440"/>
+            <w:tcMar>
+              <w:top w:w="60" w:type="dxa"/>
+              <w:bottom w:w="60" w:type="dxa"/>
+              <w:left w:w="90" w:type="dxa"/>
+              <w:right w:w="90" w:type="dxa"/>
+            </w:tcMar>
+            <w:shd w:val="clear" w:color="auto" w:fill="FFFFFF"/>
+          </w:tcPr>
+          <w:p>
+            <w:pPr>
+              <w:spacing w:line="276" w:lineRule="auto"/>
+              <w:jc w:val="left"/>
+            </w:pPr>
+            <w:r>
+              <w:rPr>
+                <w:rFonts w:ascii="Consolas" w:hAnsi="Consolas"/>
+                <w:b/>
+                <w:color w:val="0F172A"/>
+                <w:sz w:val="19"/>
+              </w:rPr>
+              <w:t>6f147e3</w:t>
+            </w:r>
+          </w:p>
+        </w:tc>
+        <w:tc>
+          <w:tcPr>
+            <w:tcW w:type="dxa" w:w="1440"/>
+            <w:tcMar>
+              <w:top w:w="60" w:type="dxa"/>
+              <w:bottom w:w="60" w:type="dxa"/>
+              <w:left w:w="90" w:type="dxa"/>
+              <w:right w:w="90" w:type="dxa"/>
+            </w:tcMar>
+            <w:shd w:val="clear" w:color="auto" w:fill="FFFFFF"/>
+          </w:tcPr>
+          <w:p>
+            <w:pPr>
+              <w:spacing w:line="276" w:lineRule="auto"/>
+              <w:jc w:val="left"/>
+            </w:pPr>
+            <w:r>
+              <w:rPr>
+                <w:rFonts w:ascii="Times New Roman" w:hAnsi="Times New Roman"/>
+                <w:color w:val="1E293B"/>
+                <w:sz w:val="19"/>
+              </w:rPr>
+              <w:t>2026-10-17</w:t>
+            </w:r>
+          </w:p>
+        </w:tc>
+        <w:tc>
+          <w:tcPr>
+            <w:tcW w:type="dxa" w:w="1872"/>
+            <w:tcMar>
+              <w:top w:w="60" w:type="dxa"/>
+              <w:bottom w:w="60" w:type="dxa"/>
+              <w:left w:w="90" w:type="dxa"/>
+              <w:right w:w="90" w:type="dxa"/>
+            </w:tcMar>
+            <w:shd w:val="clear" w:color="auto" w:fill="FFFFFF"/>
+          </w:tcPr>
+          <w:p>
+            <w:pPr>
+              <w:spacing w:line="276" w:lineRule="auto"/>
+              <w:jc w:val="left"/>
+            </w:pPr>
+            <w:r>
+              <w:rPr>
+                <w:rFonts w:ascii="Times New Roman" w:hAnsi="Times New Roman"/>
+                <w:b/>
+                <w:color w:val="1E293B"/>
+                <w:sz w:val="19"/>
+              </w:rPr>
+              <w:t>Prakash Raj U</w:t>
+            </w:r>
+          </w:p>
+        </w:tc>
+        <w:tc>
+          <w:tcPr>
+            <w:tcW w:type="dxa" w:w="3312"/>
+            <w:tcMar>
+              <w:top w:w="60" w:type="dxa"/>
+              <w:bottom w:w="60" w:type="dxa"/>
+              <w:left w:w="90" w:type="dxa"/>
+              <w:right w:w="90" w:type="dxa"/>
+            </w:tcMar>
+            <w:shd w:val="clear" w:color="auto" w:fill="FFFFFF"/>
+          </w:tcPr>
+          <w:p>
+            <w:pPr>
+              <w:spacing w:line="276" w:lineRule="auto"/>
+              <w:jc w:val="left"/>
+            </w:pPr>
+            <w:r>
+              <w:rPr>
+                <w:rFonts w:ascii="Times New Roman" w:hAnsi="Times New Roman"/>
+                <w:color w:val="1E293B"/>
+                <w:sz w:val="19"/>
+              </w:rPr>
+              <w:t>feat(ci-02): add multi-encoding log parser support for Jenkins build recorder [CR-007]</w:t>
+            </w:r>
+          </w:p>
+        </w:tc>
+        <w:tc>
+          <w:tcPr>
+            <w:tcW w:type="dxa" w:w="1440"/>
+            <w:tcMar>
+              <w:top w:w="60" w:type="dxa"/>
+              <w:bottom w:w="60" w:type="dxa"/>
+              <w:left w:w="90" w:type="dxa"/>
+              <w:right w:w="90" w:type="dxa"/>
+            </w:tcMar>
+            <w:shd w:val="clear" w:color="auto" w:fill="FFFFFF"/>
+          </w:tcPr>
+          <w:p>
+            <w:pPr>
+              <w:spacing w:line="276" w:lineRule="auto"/>
+              <w:jc w:val="left"/>
+            </w:pPr>
+            <w:r>
+              <w:rPr>
+                <w:rFonts w:ascii="Times New Roman" w:hAnsi="Times New Roman"/>
+                <w:color w:val="1E293B"/>
+                <w:sz w:val="19"/>
+              </w:rPr>
+              <w:t>CI-02</w:t>
+            </w:r>
+          </w:p>
+        </w:tc>
+      </w:tr>
+      <w:tr>
+        <w:tc>
+          <w:tcPr>
+            <w:tcW w:type="dxa" w:w="1440"/>
+            <w:tcMar>
+              <w:top w:w="60" w:type="dxa"/>
+              <w:bottom w:w="60" w:type="dxa"/>
+              <w:left w:w="90" w:type="dxa"/>
+              <w:right w:w="90" w:type="dxa"/>
+            </w:tcMar>
+            <w:shd w:val="clear" w:color="auto" w:fill="F8FAFC"/>
+          </w:tcPr>
+          <w:p>
+            <w:pPr>
+              <w:spacing w:line="276" w:lineRule="auto"/>
+              <w:jc w:val="left"/>
+            </w:pPr>
+            <w:r>
+              <w:rPr>
+                <w:rFonts w:ascii="Consolas" w:hAnsi="Consolas"/>
+                <w:b/>
+                <w:color w:val="0F172A"/>
+                <w:sz w:val="19"/>
+              </w:rPr>
+              <w:t>d6b3be0</w:t>
+            </w:r>
+          </w:p>
+        </w:tc>
+        <w:tc>
+          <w:tcPr>
+            <w:tcW w:type="dxa" w:w="1440"/>
+            <w:tcMar>
+              <w:top w:w="60" w:type="dxa"/>
+              <w:bottom w:w="60" w:type="dxa"/>
+              <w:left w:w="90" w:type="dxa"/>
+              <w:right w:w="90" w:type="dxa"/>
+            </w:tcMar>
+            <w:shd w:val="clear" w:color="auto" w:fill="F8FAFC"/>
+          </w:tcPr>
+          <w:p>
+            <w:pPr>
+              <w:spacing w:line="276" w:lineRule="auto"/>
+              <w:jc w:val="left"/>
+            </w:pPr>
+            <w:r>
+              <w:rPr>
+                <w:rFonts w:ascii="Times New Roman" w:hAnsi="Times New Roman"/>
+                <w:color w:val="1E293B"/>
+                <w:sz w:val="19"/>
+              </w:rPr>
+              <w:t>2026-10-18</w:t>
+            </w:r>
+          </w:p>
+        </w:tc>
+        <w:tc>
+          <w:tcPr>
+            <w:tcW w:type="dxa" w:w="1872"/>
+            <w:tcMar>
+              <w:top w:w="60" w:type="dxa"/>
+              <w:bottom w:w="60" w:type="dxa"/>
+              <w:left w:w="90" w:type="dxa"/>
+              <w:right w:w="90" w:type="dxa"/>
+            </w:tcMar>
+            <w:shd w:val="clear" w:color="auto" w:fill="F8FAFC"/>
+          </w:tcPr>
+          <w:p>
+            <w:pPr>
+              <w:spacing w:line="276" w:lineRule="auto"/>
+              <w:jc w:val="left"/>
+            </w:pPr>
+            <w:r>
+              <w:rPr>
+                <w:rFonts w:ascii="Times New Roman" w:hAnsi="Times New Roman"/>
+                <w:b/>
+                <w:color w:val="1E293B"/>
+                <w:sz w:val="19"/>
+              </w:rPr>
+              <w:t>Bharathwaraj K S</w:t>
+            </w:r>
+          </w:p>
+        </w:tc>
+        <w:tc>
+          <w:tcPr>
+            <w:tcW w:type="dxa" w:w="3312"/>
+            <w:tcMar>
+              <w:top w:w="60" w:type="dxa"/>
+              <w:bottom w:w="60" w:type="dxa"/>
+              <w:left w:w="90" w:type="dxa"/>
+              <w:right w:w="90" w:type="dxa"/>
+            </w:tcMar>
+            <w:shd w:val="clear" w:color="auto" w:fill="F8FAFC"/>
+          </w:tcPr>
+          <w:p>
+            <w:pPr>
+              <w:spacing w:line="276" w:lineRule="auto"/>
+              <w:jc w:val="left"/>
+            </w:pPr>
+            <w:r>
+              <w:rPr>
+                <w:rFonts w:ascii="Times New Roman" w:hAnsi="Times New Roman"/>
+                <w:color w:val="1E293B"/>
+                <w:sz w:val="19"/>
+              </w:rPr>
+              <w:t>feat(ci-09): add range validation logic to Validator service for employee module [CR-010]</w:t>
+            </w:r>
+          </w:p>
+        </w:tc>
+        <w:tc>
+          <w:tcPr>
+            <w:tcW w:type="dxa" w:w="1440"/>
+            <w:tcMar>
+              <w:top w:w="60" w:type="dxa"/>
+              <w:bottom w:w="60" w:type="dxa"/>
+              <w:left w:w="90" w:type="dxa"/>
+              <w:right w:w="90" w:type="dxa"/>
+            </w:tcMar>
+            <w:shd w:val="clear" w:color="auto" w:fill="F8FAFC"/>
+          </w:tcPr>
+          <w:p>
+            <w:pPr>
+              <w:spacing w:line="276" w:lineRule="auto"/>
+              <w:jc w:val="left"/>
+            </w:pPr>
+            <w:r>
+              <w:rPr>
+                <w:rFonts w:ascii="Times New Roman" w:hAnsi="Times New Roman"/>
+                <w:color w:val="1E293B"/>
+                <w:sz w:val="19"/>
+              </w:rPr>
+              <w:t>CI-09</w:t>
+            </w:r>
+          </w:p>
+        </w:tc>
+      </w:tr>
+      <w:tr>
+        <w:tc>
+          <w:tcPr>
+            <w:tcW w:type="dxa" w:w="1440"/>
+            <w:tcMar>
+              <w:top w:w="60" w:type="dxa"/>
+              <w:bottom w:w="60" w:type="dxa"/>
+              <w:left w:w="90" w:type="dxa"/>
+              <w:right w:w="90" w:type="dxa"/>
+            </w:tcMar>
+            <w:shd w:val="clear" w:color="auto" w:fill="FFFFFF"/>
+          </w:tcPr>
+          <w:p>
+            <w:pPr>
+              <w:spacing w:line="276" w:lineRule="auto"/>
+              <w:jc w:val="left"/>
+            </w:pPr>
+            <w:r>
+              <w:rPr>
+                <w:rFonts w:ascii="Consolas" w:hAnsi="Consolas"/>
+                <w:b/>
+                <w:color w:val="0F172A"/>
+                <w:sz w:val="19"/>
+              </w:rPr>
+              <w:t>077e17c</w:t>
+            </w:r>
+          </w:p>
+        </w:tc>
+        <w:tc>
+          <w:tcPr>
+            <w:tcW w:type="dxa" w:w="1440"/>
+            <w:tcMar>
+              <w:top w:w="60" w:type="dxa"/>
+              <w:bottom w:w="60" w:type="dxa"/>
+              <w:left w:w="90" w:type="dxa"/>
+              <w:right w:w="90" w:type="dxa"/>
+            </w:tcMar>
+            <w:shd w:val="clear" w:color="auto" w:fill="FFFFFF"/>
+          </w:tcPr>
+          <w:p>
+            <w:pPr>
+              <w:spacing w:line="276" w:lineRule="auto"/>
+              <w:jc w:val="left"/>
+            </w:pPr>
+            <w:r>
+              <w:rPr>
+                <w:rFonts w:ascii="Times New Roman" w:hAnsi="Times New Roman"/>
+                <w:color w:val="1E293B"/>
+                <w:sz w:val="19"/>
+              </w:rPr>
+              <w:t>2026-10-19</w:t>
+            </w:r>
+          </w:p>
+        </w:tc>
+        <w:tc>
+          <w:tcPr>
+            <w:tcW w:type="dxa" w:w="1872"/>
+            <w:tcMar>
+              <w:top w:w="60" w:type="dxa"/>
+              <w:bottom w:w="60" w:type="dxa"/>
+              <w:left w:w="90" w:type="dxa"/>
+              <w:right w:w="90" w:type="dxa"/>
+            </w:tcMar>
+            <w:shd w:val="clear" w:color="auto" w:fill="FFFFFF"/>
+          </w:tcPr>
+          <w:p>
+            <w:pPr>
+              <w:spacing w:line="276" w:lineRule="auto"/>
+              <w:jc w:val="left"/>
+            </w:pPr>
+            <w:r>
+              <w:rPr>
+                <w:rFonts w:ascii="Times New Roman" w:hAnsi="Times New Roman"/>
+                <w:b/>
+                <w:color w:val="1E293B"/>
+                <w:sz w:val="19"/>
+              </w:rPr>
+              <w:t>Prakash Raj U</w:t>
+            </w:r>
+          </w:p>
+        </w:tc>
+        <w:tc>
+          <w:tcPr>
+            <w:tcW w:type="dxa" w:w="3312"/>
+            <w:tcMar>
+              <w:top w:w="60" w:type="dxa"/>
+              <w:bottom w:w="60" w:type="dxa"/>
+              <w:left w:w="90" w:type="dxa"/>
+              <w:right w:w="90" w:type="dxa"/>
+            </w:tcMar>
+            <w:shd w:val="clear" w:color="auto" w:fill="FFFFFF"/>
+          </w:tcPr>
+          <w:p>
+            <w:pPr>
+              <w:spacing w:line="276" w:lineRule="auto"/>
+              <w:jc w:val="left"/>
+            </w:pPr>
+            <w:r>
+              <w:rPr>
+                <w:rFonts w:ascii="Times New Roman" w:hAnsi="Times New Roman"/>
+                <w:color w:val="1E293B"/>
+                <w:sz w:val="19"/>
+              </w:rPr>
+              <w:t>feat(ci-09): update calculation logic in Calculator add method for boundary testing [CR-011]</w:t>
+            </w:r>
+          </w:p>
+        </w:tc>
+        <w:tc>
+          <w:tcPr>
+            <w:tcW w:type="dxa" w:w="1440"/>
+            <w:tcMar>
+              <w:top w:w="60" w:type="dxa"/>
+              <w:bottom w:w="60" w:type="dxa"/>
+              <w:left w:w="90" w:type="dxa"/>
+              <w:right w:w="90" w:type="dxa"/>
+            </w:tcMar>
+            <w:shd w:val="clear" w:color="auto" w:fill="FFFFFF"/>
+          </w:tcPr>
+          <w:p>
+            <w:pPr>
+              <w:spacing w:line="276" w:lineRule="auto"/>
+              <w:jc w:val="left"/>
+            </w:pPr>
+            <w:r>
+              <w:rPr>
+                <w:rFonts w:ascii="Times New Roman" w:hAnsi="Times New Roman"/>
+                <w:color w:val="1E293B"/>
+                <w:sz w:val="19"/>
+              </w:rPr>
+              <w:t>CI-09</w:t>
+            </w:r>
+          </w:p>
+        </w:tc>
+      </w:tr>
+      <w:tr>
+        <w:tc>
+          <w:tcPr>
+            <w:tcW w:type="dxa" w:w="1440"/>
+            <w:tcMar>
+              <w:top w:w="60" w:type="dxa"/>
+              <w:bottom w:w="60" w:type="dxa"/>
+              <w:left w:w="90" w:type="dxa"/>
+              <w:right w:w="90" w:type="dxa"/>
+            </w:tcMar>
+            <w:shd w:val="clear" w:color="auto" w:fill="F8FAFC"/>
+          </w:tcPr>
+          <w:p>
+            <w:pPr>
+              <w:spacing w:line="276" w:lineRule="auto"/>
+              <w:jc w:val="left"/>
+            </w:pPr>
+            <w:r>
+              <w:rPr>
+                <w:rFonts w:ascii="Consolas" w:hAnsi="Consolas"/>
+                <w:b/>
+                <w:color w:val="0F172A"/>
+                <w:sz w:val="19"/>
+              </w:rPr>
+              <w:t>4025917</w:t>
+            </w:r>
+          </w:p>
+        </w:tc>
+        <w:tc>
+          <w:tcPr>
+            <w:tcW w:type="dxa" w:w="1440"/>
+            <w:tcMar>
+              <w:top w:w="60" w:type="dxa"/>
+              <w:bottom w:w="60" w:type="dxa"/>
+              <w:left w:w="90" w:type="dxa"/>
+              <w:right w:w="90" w:type="dxa"/>
+            </w:tcMar>
+            <w:shd w:val="clear" w:color="auto" w:fill="F8FAFC"/>
+          </w:tcPr>
+          <w:p>
+            <w:pPr>
+              <w:spacing w:line="276" w:lineRule="auto"/>
+              <w:jc w:val="left"/>
+            </w:pPr>
+            <w:r>
+              <w:rPr>
+                <w:rFonts w:ascii="Times New Roman" w:hAnsi="Times New Roman"/>
+                <w:color w:val="1E293B"/>
+                <w:sz w:val="19"/>
+              </w:rPr>
+              <w:t>2026-10-20</w:t>
+            </w:r>
+          </w:p>
+        </w:tc>
+        <w:tc>
+          <w:tcPr>
+            <w:tcW w:type="dxa" w:w="1872"/>
+            <w:tcMar>
+              <w:top w:w="60" w:type="dxa"/>
+              <w:bottom w:w="60" w:type="dxa"/>
+              <w:left w:w="90" w:type="dxa"/>
+              <w:right w:w="90" w:type="dxa"/>
+            </w:tcMar>
+            <w:shd w:val="clear" w:color="auto" w:fill="F8FAFC"/>
+          </w:tcPr>
+          <w:p>
+            <w:pPr>
+              <w:spacing w:line="276" w:lineRule="auto"/>
+              <w:jc w:val="left"/>
+            </w:pPr>
+            <w:r>
+              <w:rPr>
+                <w:rFonts w:ascii="Times New Roman" w:hAnsi="Times New Roman"/>
+                <w:b/>
+                <w:color w:val="1E293B"/>
+                <w:sz w:val="19"/>
+              </w:rPr>
+              <w:t>Arun Kumar</w:t>
+            </w:r>
+          </w:p>
+        </w:tc>
+        <w:tc>
+          <w:tcPr>
+            <w:tcW w:type="dxa" w:w="3312"/>
+            <w:tcMar>
+              <w:top w:w="60" w:type="dxa"/>
+              <w:bottom w:w="60" w:type="dxa"/>
+              <w:left w:w="90" w:type="dxa"/>
+              <w:right w:w="90" w:type="dxa"/>
+            </w:tcMar>
+            <w:shd w:val="clear" w:color="auto" w:fill="F8FAFC"/>
+          </w:tcPr>
+          <w:p>
+            <w:pPr>
+              <w:spacing w:line="276" w:lineRule="auto"/>
+              <w:jc w:val="left"/>
+            </w:pPr>
+            <w:r>
+              <w:rPr>
+                <w:rFonts w:ascii="Times New Roman" w:hAnsi="Times New Roman"/>
+                <w:color w:val="1E293B"/>
+                <w:sz w:val="19"/>
+              </w:rPr>
+              <w:t>tune(ci-03): refine attribution scoring weights &amp; Bayesian confidence thresholds [CR-012]</w:t>
+            </w:r>
+          </w:p>
+        </w:tc>
+        <w:tc>
+          <w:tcPr>
+            <w:tcW w:type="dxa" w:w="1440"/>
+            <w:tcMar>
+              <w:top w:w="60" w:type="dxa"/>
+              <w:bottom w:w="60" w:type="dxa"/>
+              <w:left w:w="90" w:type="dxa"/>
+              <w:right w:w="90" w:type="dxa"/>
+            </w:tcMar>
+            <w:shd w:val="clear" w:color="auto" w:fill="F8FAFC"/>
+          </w:tcPr>
+          <w:p>
+            <w:pPr>
+              <w:spacing w:line="276" w:lineRule="auto"/>
+              <w:jc w:val="left"/>
+            </w:pPr>
+            <w:r>
+              <w:rPr>
+                <w:rFonts w:ascii="Times New Roman" w:hAnsi="Times New Roman"/>
+                <w:color w:val="1E293B"/>
+                <w:sz w:val="19"/>
+              </w:rPr>
+              <w:t>CI-03</w:t>
+            </w:r>
+          </w:p>
+        </w:tc>
+      </w:tr>
+      <w:tr>
+        <w:tc>
+          <w:tcPr>
+            <w:tcW w:type="dxa" w:w="1440"/>
+            <w:tcMar>
+              <w:top w:w="60" w:type="dxa"/>
+              <w:bottom w:w="60" w:type="dxa"/>
+              <w:left w:w="90" w:type="dxa"/>
+              <w:right w:w="90" w:type="dxa"/>
+            </w:tcMar>
+            <w:shd w:val="clear" w:color="auto" w:fill="FFFFFF"/>
+          </w:tcPr>
+          <w:p>
+            <w:pPr>
+              <w:spacing w:line="276" w:lineRule="auto"/>
+              <w:jc w:val="left"/>
+            </w:pPr>
+            <w:r>
+              <w:rPr>
+                <w:rFonts w:ascii="Consolas" w:hAnsi="Consolas"/>
+                <w:b/>
+                <w:color w:val="0F172A"/>
+                <w:sz w:val="19"/>
+              </w:rPr>
+              <w:t>5fbf9c0</w:t>
+            </w:r>
+          </w:p>
+        </w:tc>
+        <w:tc>
+          <w:tcPr>
+            <w:tcW w:type="dxa" w:w="1440"/>
+            <w:tcMar>
+              <w:top w:w="60" w:type="dxa"/>
+              <w:bottom w:w="60" w:type="dxa"/>
+              <w:left w:w="90" w:type="dxa"/>
+              <w:right w:w="90" w:type="dxa"/>
+            </w:tcMar>
+            <w:shd w:val="clear" w:color="auto" w:fill="FFFFFF"/>
+          </w:tcPr>
+          <w:p>
+            <w:pPr>
+              <w:spacing w:line="276" w:lineRule="auto"/>
+              <w:jc w:val="left"/>
+            </w:pPr>
+            <w:r>
+              <w:rPr>
+                <w:rFonts w:ascii="Times New Roman" w:hAnsi="Times New Roman"/>
+                <w:color w:val="1E293B"/>
+                <w:sz w:val="19"/>
+              </w:rPr>
+              <w:t>2026-10-20</w:t>
+            </w:r>
+          </w:p>
+        </w:tc>
+        <w:tc>
+          <w:tcPr>
+            <w:tcW w:type="dxa" w:w="1872"/>
+            <w:tcMar>
+              <w:top w:w="60" w:type="dxa"/>
+              <w:bottom w:w="60" w:type="dxa"/>
+              <w:left w:w="90" w:type="dxa"/>
+              <w:right w:w="90" w:type="dxa"/>
+            </w:tcMar>
+            <w:shd w:val="clear" w:color="auto" w:fill="FFFFFF"/>
+          </w:tcPr>
+          <w:p>
+            <w:pPr>
+              <w:spacing w:line="276" w:lineRule="auto"/>
+              <w:jc w:val="left"/>
+            </w:pPr>
+            <w:r>
+              <w:rPr>
+                <w:rFonts w:ascii="Times New Roman" w:hAnsi="Times New Roman"/>
+                <w:b/>
+                <w:color w:val="1E293B"/>
+                <w:sz w:val="19"/>
+              </w:rPr>
+              <w:t>Kavya Sharma</w:t>
+            </w:r>
+          </w:p>
+        </w:tc>
+        <w:tc>
+          <w:tcPr>
+            <w:tcW w:type="dxa" w:w="3312"/>
+            <w:tcMar>
+              <w:top w:w="60" w:type="dxa"/>
+              <w:bottom w:w="60" w:type="dxa"/>
+              <w:left w:w="90" w:type="dxa"/>
+              <w:right w:w="90" w:type="dxa"/>
+            </w:tcMar>
+            <w:shd w:val="clear" w:color="auto" w:fill="FFFFFF"/>
+          </w:tcPr>
+          <w:p>
+            <w:pPr>
+              <w:spacing w:line="276" w:lineRule="auto"/>
+              <w:jc w:val="left"/>
+            </w:pPr>
+            <w:r>
+              <w:rPr>
+                <w:rFonts w:ascii="Times New Roman" w:hAnsi="Times New Roman"/>
+                <w:color w:val="1E293B"/>
+                <w:sz w:val="19"/>
+              </w:rPr>
+              <w:t>test(ci-06): add collaborative team workflow &amp; multi-developer CI test matrix [CR-013]</w:t>
+            </w:r>
+          </w:p>
+        </w:tc>
+        <w:tc>
+          <w:tcPr>
+            <w:tcW w:type="dxa" w:w="1440"/>
+            <w:tcMar>
+              <w:top w:w="60" w:type="dxa"/>
+              <w:bottom w:w="60" w:type="dxa"/>
+              <w:left w:w="90" w:type="dxa"/>
+              <w:right w:w="90" w:type="dxa"/>
+            </w:tcMar>
+            <w:shd w:val="clear" w:color="auto" w:fill="FFFFFF"/>
+          </w:tcPr>
+          <w:p>
+            <w:pPr>
+              <w:spacing w:line="276" w:lineRule="auto"/>
+              <w:jc w:val="left"/>
+            </w:pPr>
+            <w:r>
+              <w:rPr>
+                <w:rFonts w:ascii="Times New Roman" w:hAnsi="Times New Roman"/>
+                <w:color w:val="1E293B"/>
+                <w:sz w:val="19"/>
+              </w:rPr>
+              <w:t>CI-06</w:t>
+            </w:r>
+          </w:p>
+        </w:tc>
+      </w:tr>
+      <w:tr>
+        <w:tc>
+          <w:tcPr>
+            <w:tcW w:type="dxa" w:w="1440"/>
+            <w:tcMar>
+              <w:top w:w="60" w:type="dxa"/>
+              <w:bottom w:w="60" w:type="dxa"/>
+              <w:left w:w="90" w:type="dxa"/>
+              <w:right w:w="90" w:type="dxa"/>
+            </w:tcMar>
+            <w:shd w:val="clear" w:color="auto" w:fill="F8FAFC"/>
+          </w:tcPr>
+          <w:p>
+            <w:pPr>
+              <w:spacing w:line="276" w:lineRule="auto"/>
+              <w:jc w:val="left"/>
+            </w:pPr>
+            <w:r>
+              <w:rPr>
+                <w:rFonts w:ascii="Consolas" w:hAnsi="Consolas"/>
+                <w:b/>
+                <w:color w:val="0F172A"/>
+                <w:sz w:val="19"/>
+              </w:rPr>
+              <w:t>74aa410</w:t>
+            </w:r>
+          </w:p>
+        </w:tc>
+        <w:tc>
+          <w:tcPr>
+            <w:tcW w:type="dxa" w:w="1440"/>
+            <w:tcMar>
+              <w:top w:w="60" w:type="dxa"/>
+              <w:bottom w:w="60" w:type="dxa"/>
+              <w:left w:w="90" w:type="dxa"/>
+              <w:right w:w="90" w:type="dxa"/>
+            </w:tcMar>
+            <w:shd w:val="clear" w:color="auto" w:fill="F8FAFC"/>
+          </w:tcPr>
+          <w:p>
+            <w:pPr>
+              <w:spacing w:line="276" w:lineRule="auto"/>
+              <w:jc w:val="left"/>
+            </w:pPr>
+            <w:r>
+              <w:rPr>
+                <w:rFonts w:ascii="Times New Roman" w:hAnsi="Times New Roman"/>
+                <w:color w:val="1E293B"/>
+                <w:sz w:val="19"/>
+              </w:rPr>
+              <w:t>2026-10-21</w:t>
+            </w:r>
+          </w:p>
+        </w:tc>
+        <w:tc>
+          <w:tcPr>
+            <w:tcW w:type="dxa" w:w="1872"/>
+            <w:tcMar>
+              <w:top w:w="60" w:type="dxa"/>
+              <w:bottom w:w="60" w:type="dxa"/>
+              <w:left w:w="90" w:type="dxa"/>
+              <w:right w:w="90" w:type="dxa"/>
+            </w:tcMar>
+            <w:shd w:val="clear" w:color="auto" w:fill="F8FAFC"/>
+          </w:tcPr>
+          <w:p>
+            <w:pPr>
+              <w:spacing w:line="276" w:lineRule="auto"/>
+              <w:jc w:val="left"/>
+            </w:pPr>
+            <w:r>
+              <w:rPr>
+                <w:rFonts w:ascii="Times New Roman" w:hAnsi="Times New Roman"/>
+                <w:b/>
+                <w:color w:val="1E293B"/>
+                <w:sz w:val="19"/>
+              </w:rPr>
+              <w:t>Bharathwaraj K S</w:t>
+            </w:r>
+          </w:p>
+        </w:tc>
+        <w:tc>
+          <w:tcPr>
+            <w:tcW w:type="dxa" w:w="3312"/>
+            <w:tcMar>
+              <w:top w:w="60" w:type="dxa"/>
+              <w:bottom w:w="60" w:type="dxa"/>
+              <w:left w:w="90" w:type="dxa"/>
+              <w:right w:w="90" w:type="dxa"/>
+            </w:tcMar>
+            <w:shd w:val="clear" w:color="auto" w:fill="F8FAFC"/>
+          </w:tcPr>
+          <w:p>
+            <w:pPr>
+              <w:spacing w:line="276" w:lineRule="auto"/>
+              <w:jc w:val="left"/>
+            </w:pPr>
+            <w:r>
+              <w:rPr>
+                <w:rFonts w:ascii="Times New Roman" w:hAnsi="Times New Roman"/>
+                <w:color w:val="1E293B"/>
+                <w:sz w:val="19"/>
+              </w:rPr>
+              <w:t>Merge pull request #4 from feature/multi-developer-collab into develop (CR-014)</w:t>
+            </w:r>
+          </w:p>
+        </w:tc>
+        <w:tc>
+          <w:tcPr>
+            <w:tcW w:type="dxa" w:w="1440"/>
+            <w:tcMar>
+              <w:top w:w="60" w:type="dxa"/>
+              <w:bottom w:w="60" w:type="dxa"/>
+              <w:left w:w="90" w:type="dxa"/>
+              <w:right w:w="90" w:type="dxa"/>
+            </w:tcMar>
+            <w:shd w:val="clear" w:color="auto" w:fill="F8FAFC"/>
+          </w:tcPr>
+          <w:p>
+            <w:pPr>
+              <w:spacing w:line="276" w:lineRule="auto"/>
+              <w:jc w:val="left"/>
+            </w:pPr>
+            <w:r>
+              <w:rPr>
+                <w:rFonts w:ascii="Times New Roman" w:hAnsi="Times New Roman"/>
+                <w:color w:val="1E293B"/>
+                <w:sz w:val="19"/>
+              </w:rPr>
+              <w:t>CI-06, CI-09</w:t>
+            </w:r>
+          </w:p>
+        </w:tc>
+      </w:tr>
+      <w:tr>
+        <w:tc>
+          <w:tcPr>
+            <w:tcW w:type="dxa" w:w="1440"/>
+            <w:tcMar>
+              <w:top w:w="60" w:type="dxa"/>
+              <w:bottom w:w="60" w:type="dxa"/>
+              <w:left w:w="90" w:type="dxa"/>
+              <w:right w:w="90" w:type="dxa"/>
+            </w:tcMar>
+            <w:shd w:val="clear" w:color="auto" w:fill="FFFFFF"/>
+          </w:tcPr>
+          <w:p>
+            <w:pPr>
+              <w:spacing w:line="276" w:lineRule="auto"/>
+              <w:jc w:val="left"/>
+            </w:pPr>
+            <w:r>
+              <w:rPr>
+                <w:rFonts w:ascii="Consolas" w:hAnsi="Consolas"/>
+                <w:b/>
+                <w:color w:val="0F172A"/>
+                <w:sz w:val="19"/>
+              </w:rPr>
+              <w:t>7e43c78</w:t>
+            </w:r>
+          </w:p>
+        </w:tc>
+        <w:tc>
+          <w:tcPr>
+            <w:tcW w:type="dxa" w:w="1440"/>
+            <w:tcMar>
+              <w:top w:w="60" w:type="dxa"/>
+              <w:bottom w:w="60" w:type="dxa"/>
+              <w:left w:w="90" w:type="dxa"/>
+              <w:right w:w="90" w:type="dxa"/>
+            </w:tcMar>
+            <w:shd w:val="clear" w:color="auto" w:fill="FFFFFF"/>
+          </w:tcPr>
+          <w:p>
+            <w:pPr>
+              <w:spacing w:line="276" w:lineRule="auto"/>
+              <w:jc w:val="left"/>
+            </w:pPr>
+            <w:r>
+              <w:rPr>
+                <w:rFonts w:ascii="Times New Roman" w:hAnsi="Times New Roman"/>
+                <w:color w:val="1E293B"/>
+                <w:sz w:val="19"/>
+              </w:rPr>
+              <w:t>2026-10-21</w:t>
+            </w:r>
+          </w:p>
+        </w:tc>
+        <w:tc>
+          <w:tcPr>
+            <w:tcW w:type="dxa" w:w="1872"/>
+            <w:tcMar>
+              <w:top w:w="60" w:type="dxa"/>
+              <w:bottom w:w="60" w:type="dxa"/>
+              <w:left w:w="90" w:type="dxa"/>
+              <w:right w:w="90" w:type="dxa"/>
+            </w:tcMar>
+            <w:shd w:val="clear" w:color="auto" w:fill="FFFFFF"/>
+          </w:tcPr>
+          <w:p>
+            <w:pPr>
+              <w:spacing w:line="276" w:lineRule="auto"/>
+              <w:jc w:val="left"/>
+            </w:pPr>
+            <w:r>
+              <w:rPr>
+                <w:rFonts w:ascii="Times New Roman" w:hAnsi="Times New Roman"/>
+                <w:b/>
+                <w:color w:val="1E293B"/>
+                <w:sz w:val="19"/>
+              </w:rPr>
+              <w:t>Prakash Raj U</w:t>
+            </w:r>
+          </w:p>
+        </w:tc>
+        <w:tc>
+          <w:tcPr>
+            <w:tcW w:type="dxa" w:w="3312"/>
+            <w:tcMar>
+              <w:top w:w="60" w:type="dxa"/>
+              <w:bottom w:w="60" w:type="dxa"/>
+              <w:left w:w="90" w:type="dxa"/>
+              <w:right w:w="90" w:type="dxa"/>
+            </w:tcMar>
+            <w:shd w:val="clear" w:color="auto" w:fill="FFFFFF"/>
+          </w:tcPr>
+          <w:p>
+            <w:pPr>
+              <w:spacing w:line="276" w:lineRule="auto"/>
+              <w:jc w:val="left"/>
+            </w:pPr>
+            <w:r>
+              <w:rPr>
+                <w:rFonts w:ascii="Times New Roman" w:hAnsi="Times New Roman"/>
+                <w:color w:val="1E293B"/>
+                <w:sz w:val="19"/>
+              </w:rPr>
+              <w:t>Merge branch develop into main: Production Release Baseline v1.0.0 [Release v1.0.0]</w:t>
+            </w:r>
+          </w:p>
+        </w:tc>
+        <w:tc>
+          <w:tcPr>
+            <w:tcW w:type="dxa" w:w="1440"/>
+            <w:tcMar>
+              <w:top w:w="60" w:type="dxa"/>
+              <w:bottom w:w="60" w:type="dxa"/>
+              <w:left w:w="90" w:type="dxa"/>
+              <w:right w:w="90" w:type="dxa"/>
+            </w:tcMar>
+            <w:shd w:val="clear" w:color="auto" w:fill="FFFFFF"/>
+          </w:tcPr>
+          <w:p>
+            <w:pPr>
+              <w:spacing w:line="276" w:lineRule="auto"/>
+              <w:jc w:val="left"/>
+            </w:pPr>
+            <w:r>
+              <w:rPr>
+                <w:rFonts w:ascii="Times New Roman" w:hAnsi="Times New Roman"/>
+                <w:color w:val="1E293B"/>
+                <w:sz w:val="19"/>
+              </w:rPr>
+              <w:t>Release v1.0.0</w:t>
+            </w:r>
+          </w:p>
+        </w:tc>
+      </w:tr>
+      <w:tr>
+        <w:tc>
+          <w:tcPr>
+            <w:tcW w:type="dxa" w:w="1440"/>
+            <w:tcMar>
+              <w:top w:w="60" w:type="dxa"/>
+              <w:bottom w:w="60" w:type="dxa"/>
+              <w:left w:w="90" w:type="dxa"/>
+              <w:right w:w="90" w:type="dxa"/>
+            </w:tcMar>
+            <w:shd w:val="clear" w:color="auto" w:fill="F8FAFC"/>
+          </w:tcPr>
+          <w:p>
+            <w:pPr>
+              <w:spacing w:line="276" w:lineRule="auto"/>
+              <w:jc w:val="left"/>
+            </w:pPr>
+            <w:r>
+              <w:rPr>
+                <w:rFonts w:ascii="Consolas" w:hAnsi="Consolas"/>
+                <w:b/>
+                <w:color w:val="0F172A"/>
+                <w:sz w:val="19"/>
+              </w:rPr>
+              <w:t>11b38f4</w:t>
+            </w:r>
+          </w:p>
+        </w:tc>
+        <w:tc>
+          <w:tcPr>
+            <w:tcW w:type="dxa" w:w="1440"/>
+            <w:tcMar>
+              <w:top w:w="60" w:type="dxa"/>
+              <w:bottom w:w="60" w:type="dxa"/>
+              <w:left w:w="90" w:type="dxa"/>
+              <w:right w:w="90" w:type="dxa"/>
+            </w:tcMar>
+            <w:shd w:val="clear" w:color="auto" w:fill="F8FAFC"/>
+          </w:tcPr>
+          <w:p>
+            <w:pPr>
+              <w:spacing w:line="276" w:lineRule="auto"/>
+              <w:jc w:val="left"/>
+            </w:pPr>
+            <w:r>
+              <w:rPr>
+                <w:rFonts w:ascii="Times New Roman" w:hAnsi="Times New Roman"/>
+                <w:color w:val="1E293B"/>
+                <w:sz w:val="19"/>
+              </w:rPr>
+              <w:t>2026-10-22</w:t>
+            </w:r>
+          </w:p>
+        </w:tc>
+        <w:tc>
+          <w:tcPr>
+            <w:tcW w:type="dxa" w:w="1872"/>
+            <w:tcMar>
+              <w:top w:w="60" w:type="dxa"/>
+              <w:bottom w:w="60" w:type="dxa"/>
+              <w:left w:w="90" w:type="dxa"/>
+              <w:right w:w="90" w:type="dxa"/>
+            </w:tcMar>
+            <w:shd w:val="clear" w:color="auto" w:fill="F8FAFC"/>
+          </w:tcPr>
+          <w:p>
+            <w:pPr>
+              <w:spacing w:line="276" w:lineRule="auto"/>
+              <w:jc w:val="left"/>
+            </w:pPr>
+            <w:r>
+              <w:rPr>
+                <w:rFonts w:ascii="Times New Roman" w:hAnsi="Times New Roman"/>
+                <w:b/>
+                <w:color w:val="1E293B"/>
+                <w:sz w:val="19"/>
+              </w:rPr>
+              <w:t>Prakash Raj U</w:t>
+            </w:r>
+          </w:p>
+        </w:tc>
+        <w:tc>
+          <w:tcPr>
+            <w:tcW w:type="dxa" w:w="3312"/>
+            <w:tcMar>
+              <w:top w:w="60" w:type="dxa"/>
+              <w:bottom w:w="60" w:type="dxa"/>
+              <w:left w:w="90" w:type="dxa"/>
+              <w:right w:w="90" w:type="dxa"/>
+            </w:tcMar>
+            <w:shd w:val="clear" w:color="auto" w:fill="F8FAFC"/>
+          </w:tcPr>
+          <w:p>
+            <w:pPr>
+              <w:spacing w:line="276" w:lineRule="auto"/>
+              <w:jc w:val="left"/>
+            </w:pPr>
+            <w:r>
+              <w:rPr>
+                <w:rFonts w:ascii="Times New Roman" w:hAnsi="Times New Roman"/>
+                <w:color w:val="1E293B"/>
+                <w:sz w:val="19"/>
+              </w:rPr>
+              <w:t>release(ci-10): finalize official release manifest, FCA/PCA sign-off &amp; audit checklist [BL-05]</w:t>
+            </w:r>
+          </w:p>
+        </w:tc>
+        <w:tc>
+          <w:tcPr>
+            <w:tcW w:type="dxa" w:w="1440"/>
+            <w:tcMar>
+              <w:top w:w="60" w:type="dxa"/>
+              <w:bottom w:w="60" w:type="dxa"/>
+              <w:left w:w="90" w:type="dxa"/>
+              <w:right w:w="90" w:type="dxa"/>
+            </w:tcMar>
+            <w:shd w:val="clear" w:color="auto" w:fill="F8FAFC"/>
+          </w:tcPr>
+          <w:p>
+            <w:pPr>
+              <w:spacing w:line="276" w:lineRule="auto"/>
+              <w:jc w:val="left"/>
+            </w:pPr>
+            <w:r>
+              <w:rPr>
+                <w:rFonts w:ascii="Times New Roman" w:hAnsi="Times New Roman"/>
+                <w:color w:val="1E293B"/>
+                <w:sz w:val="19"/>
+              </w:rPr>
+              <w:t>CI-10, Release v1.0.0</w:t>
+            </w:r>
+          </w:p>
+        </w:tc>
+      </w:tr>
+      <w:tr>
+        <w:tc>
+          <w:tcPr>
+            <w:tcW w:type="dxa" w:w="1440"/>
+            <w:tcMar>
+              <w:top w:w="60" w:type="dxa"/>
+              <w:bottom w:w="60" w:type="dxa"/>
+              <w:left w:w="90" w:type="dxa"/>
+              <w:right w:w="90" w:type="dxa"/>
+            </w:tcMar>
+            <w:shd w:val="clear" w:color="auto" w:fill="FFFFFF"/>
+          </w:tcPr>
+          <w:p>
+            <w:pPr>
+              <w:spacing w:line="276" w:lineRule="auto"/>
+              <w:jc w:val="left"/>
+            </w:pPr>
+            <w:r>
+              <w:rPr>
+                <w:rFonts w:ascii="Consolas" w:hAnsi="Consolas"/>
+                <w:b/>
+                <w:color w:val="0F172A"/>
+                <w:sz w:val="19"/>
+              </w:rPr>
+              <w:t>fa4b2c5</w:t>
+            </w:r>
+          </w:p>
+        </w:tc>
+        <w:tc>
+          <w:tcPr>
+            <w:tcW w:type="dxa" w:w="1440"/>
+            <w:tcMar>
+              <w:top w:w="60" w:type="dxa"/>
+              <w:bottom w:w="60" w:type="dxa"/>
+              <w:left w:w="90" w:type="dxa"/>
+              <w:right w:w="90" w:type="dxa"/>
+            </w:tcMar>
+            <w:shd w:val="clear" w:color="auto" w:fill="FFFFFF"/>
+          </w:tcPr>
+          <w:p>
+            <w:pPr>
+              <w:spacing w:line="276" w:lineRule="auto"/>
+              <w:jc w:val="left"/>
+            </w:pPr>
+            <w:r>
+              <w:rPr>
+                <w:rFonts w:ascii="Times New Roman" w:hAnsi="Times New Roman"/>
+                <w:color w:val="1E293B"/>
+                <w:sz w:val="19"/>
+              </w:rPr>
+              <w:t>2026-10-22</w:t>
+            </w:r>
+          </w:p>
+        </w:tc>
+        <w:tc>
+          <w:tcPr>
+            <w:tcW w:type="dxa" w:w="1872"/>
+            <w:tcMar>
+              <w:top w:w="60" w:type="dxa"/>
+              <w:bottom w:w="60" w:type="dxa"/>
+              <w:left w:w="90" w:type="dxa"/>
+              <w:right w:w="90" w:type="dxa"/>
+            </w:tcMar>
+            <w:shd w:val="clear" w:color="auto" w:fill="FFFFFF"/>
+          </w:tcPr>
+          <w:p>
+            <w:pPr>
+              <w:spacing w:line="276" w:lineRule="auto"/>
+              <w:jc w:val="left"/>
+            </w:pPr>
+            <w:r>
+              <w:rPr>
+                <w:rFonts w:ascii="Times New Roman" w:hAnsi="Times New Roman"/>
+                <w:b/>
+                <w:color w:val="1E293B"/>
+                <w:sz w:val="19"/>
+              </w:rPr>
+              <w:t>Bharathwaraj K S</w:t>
+            </w:r>
+          </w:p>
+        </w:tc>
+        <w:tc>
+          <w:tcPr>
+            <w:tcW w:type="dxa" w:w="3312"/>
+            <w:tcMar>
+              <w:top w:w="60" w:type="dxa"/>
+              <w:bottom w:w="60" w:type="dxa"/>
+              <w:left w:w="90" w:type="dxa"/>
+              <w:right w:w="90" w:type="dxa"/>
+            </w:tcMar>
+            <w:shd w:val="clear" w:color="auto" w:fill="FFFFFF"/>
+          </w:tcPr>
+          <w:p>
+            <w:pPr>
+              <w:spacing w:line="276" w:lineRule="auto"/>
+              <w:jc w:val="left"/>
+            </w:pPr>
+            <w:r>
+              <w:rPr>
+                <w:rFonts w:ascii="Times New Roman" w:hAnsi="Times New Roman"/>
+                <w:color w:val="1E293B"/>
+                <w:sz w:val="19"/>
+              </w:rPr>
+              <w:t>feat(ci-05): implement light-theme UI, TechNova 4-developer scenario &amp; SCM governance [CR-015]</w:t>
+            </w:r>
+          </w:p>
+        </w:tc>
+        <w:tc>
+          <w:tcPr>
+            <w:tcW w:type="dxa" w:w="1440"/>
+            <w:tcMar>
+              <w:top w:w="60" w:type="dxa"/>
+              <w:bottom w:w="60" w:type="dxa"/>
+              <w:left w:w="90" w:type="dxa"/>
+              <w:right w:w="90" w:type="dxa"/>
+            </w:tcMar>
+            <w:shd w:val="clear" w:color="auto" w:fill="FFFFFF"/>
+          </w:tcPr>
+          <w:p>
+            <w:pPr>
+              <w:spacing w:line="276" w:lineRule="auto"/>
+              <w:jc w:val="left"/>
+            </w:pPr>
+            <w:r>
+              <w:rPr>
+                <w:rFonts w:ascii="Times New Roman" w:hAnsi="Times New Roman"/>
+                <w:color w:val="1E293B"/>
+                <w:sz w:val="19"/>
+              </w:rPr>
+              <w:t>CI-05</w:t>
+            </w:r>
+          </w:p>
+        </w:tc>
+      </w:tr>
+      <w:tr>
+        <w:tc>
+          <w:tcPr>
+            <w:tcW w:type="dxa" w:w="1440"/>
+            <w:tcMar>
+              <w:top w:w="60" w:type="dxa"/>
+              <w:bottom w:w="60" w:type="dxa"/>
+              <w:left w:w="90" w:type="dxa"/>
+              <w:right w:w="90" w:type="dxa"/>
+            </w:tcMar>
+            <w:shd w:val="clear" w:color="auto" w:fill="F8FAFC"/>
+          </w:tcPr>
+          <w:p>
+            <w:pPr>
+              <w:spacing w:line="276" w:lineRule="auto"/>
+              <w:jc w:val="left"/>
+            </w:pPr>
+            <w:r>
+              <w:rPr>
+                <w:rFonts w:ascii="Consolas" w:hAnsi="Consolas"/>
+                <w:b/>
+                <w:color w:val="0F172A"/>
+                <w:sz w:val="19"/>
+              </w:rPr>
+              <w:t>70d43eb</w:t>
+            </w:r>
+          </w:p>
+        </w:tc>
+        <w:tc>
+          <w:tcPr>
+            <w:tcW w:type="dxa" w:w="1440"/>
+            <w:tcMar>
+              <w:top w:w="60" w:type="dxa"/>
+              <w:bottom w:w="60" w:type="dxa"/>
+              <w:left w:w="90" w:type="dxa"/>
+              <w:right w:w="90" w:type="dxa"/>
+            </w:tcMar>
+            <w:shd w:val="clear" w:color="auto" w:fill="F8FAFC"/>
+          </w:tcPr>
+          <w:p>
+            <w:pPr>
+              <w:spacing w:line="276" w:lineRule="auto"/>
+              <w:jc w:val="left"/>
+            </w:pPr>
+            <w:r>
+              <w:rPr>
+                <w:rFonts w:ascii="Times New Roman" w:hAnsi="Times New Roman"/>
+                <w:color w:val="1E293B"/>
+                <w:sz w:val="19"/>
+              </w:rPr>
+              <w:t>2026-10-22</w:t>
+            </w:r>
+          </w:p>
+        </w:tc>
+        <w:tc>
+          <w:tcPr>
+            <w:tcW w:type="dxa" w:w="1872"/>
+            <w:tcMar>
+              <w:top w:w="60" w:type="dxa"/>
+              <w:bottom w:w="60" w:type="dxa"/>
+              <w:left w:w="90" w:type="dxa"/>
+              <w:right w:w="90" w:type="dxa"/>
+            </w:tcMar>
+            <w:shd w:val="clear" w:color="auto" w:fill="F8FAFC"/>
+          </w:tcPr>
+          <w:p>
+            <w:pPr>
+              <w:spacing w:line="276" w:lineRule="auto"/>
+              <w:jc w:val="left"/>
+            </w:pPr>
+            <w:r>
+              <w:rPr>
+                <w:rFonts w:ascii="Times New Roman" w:hAnsi="Times New Roman"/>
+                <w:b/>
+                <w:color w:val="1E293B"/>
+                <w:sz w:val="19"/>
+              </w:rPr>
+              <w:t>Prakash Raj U</w:t>
+            </w:r>
+          </w:p>
+        </w:tc>
+        <w:tc>
+          <w:tcPr>
+            <w:tcW w:type="dxa" w:w="3312"/>
+            <w:tcMar>
+              <w:top w:w="60" w:type="dxa"/>
+              <w:bottom w:w="60" w:type="dxa"/>
+              <w:left w:w="90" w:type="dxa"/>
+              <w:right w:w="90" w:type="dxa"/>
+            </w:tcMar>
+            <w:shd w:val="clear" w:color="auto" w:fill="F8FAFC"/>
+          </w:tcPr>
+          <w:p>
+            <w:pPr>
+              <w:spacing w:line="276" w:lineRule="auto"/>
+              <w:jc w:val="left"/>
+            </w:pPr>
+            <w:r>
+              <w:rPr>
+                <w:rFonts w:ascii="Times New Roman" w:hAnsi="Times New Roman"/>
+                <w:color w:val="1E293B"/>
+                <w:sz w:val="19"/>
+              </w:rPr>
+              <w:t>docs(ci-08): add CommitSleuth SCM Final Review Microsoft Word documentation [CR-016]</w:t>
+            </w:r>
+          </w:p>
+        </w:tc>
+        <w:tc>
+          <w:tcPr>
+            <w:tcW w:type="dxa" w:w="1440"/>
+            <w:tcMar>
+              <w:top w:w="60" w:type="dxa"/>
+              <w:bottom w:w="60" w:type="dxa"/>
+              <w:left w:w="90" w:type="dxa"/>
+              <w:right w:w="90" w:type="dxa"/>
+            </w:tcMar>
+            <w:shd w:val="clear" w:color="auto" w:fill="F8FAFC"/>
+          </w:tcPr>
+          <w:p>
+            <w:pPr>
+              <w:spacing w:line="276" w:lineRule="auto"/>
+              <w:jc w:val="left"/>
+            </w:pPr>
+            <w:r>
+              <w:rPr>
+                <w:rFonts w:ascii="Times New Roman" w:hAnsi="Times New Roman"/>
+                <w:color w:val="1E293B"/>
+                <w:sz w:val="19"/>
+              </w:rPr>
+              <w:t>CI-08, CI-10</w:t>
+            </w:r>
+          </w:p>
+        </w:tc>
+      </w:tr>
+    </w:tbl>
+    <w:p>
+      <w:pPr>
+        <w:spacing w:line="324" w:lineRule="auto" w:after="120"/>
+        <w:jc w:val="both"/>
+      </w:pPr>
+      <w:r>
+        <w:rPr>
+          <w:rFonts w:ascii="Times New Roman" w:hAnsi="Times New Roman"/>
+          <w:color w:val="1E293B"/>
+          <w:sz w:val="24"/>
+        </w:rPr>
+      </w:r>
+    </w:p>
+    <w:p>
+      <w:pPr>
+        <w:keepNext/>
+        <w:spacing w:before="160" w:after="80"/>
+        <w:jc w:val="center"/>
+      </w:pPr>
+      <w:r>
+        <w:drawing>
+          <wp:inline xmlns:a="http://schemas.openxmlformats.org/drawingml/2006/main" xmlns:pic="http://schemas.openxmlformats.org/drawingml/2006/picture">
+            <wp:extent cx="5486400" cy="3711388"/>
+            <wp:docPr id="5" name="Picture 5"/>
+            <wp:cNvGraphicFramePr>
+              <a:graphicFrameLocks noChangeAspect="1"/>
+            </wp:cNvGraphicFramePr>
+            <a:graphic>
+              <a:graphicData uri="http://schemas.openxmlformats.org/drawingml/2006/picture">
+                <pic:pic>
+                  <pic:nvPicPr>
+                    <pic:cNvPr id="0" name="git_03_branches_gitflow.png"/>
+                    <pic:cNvPicPr/>
+                  </pic:nvPicPr>
+                  <pic:blipFill>
+                    <a:blip r:embed="rId14"/>
+                    <a:stretch>
+                      <a:fillRect/>
+                    </a:stretch>
+                  </pic:blipFill>
+                  <pic:spPr>
+                    <a:xfrm>
+                      <a:off x="0" y="0"/>
+                      <a:ext cx="5486400" cy="3711388"/>
+                    </a:xfrm>
+                    <a:prstGeom prst="rect"/>
+                  </pic:spPr>
+                </pic:pic>
+              </a:graphicData>
+            </a:graphic>
+          </wp:inline>
+        </w:drawing>
+      </w:r>
+    </w:p>
+    <w:p>
+      <w:pPr>
+        <w:keepNext/>
+        <w:spacing w:before="40" w:after="120"/>
+        <w:jc w:val="center"/>
+      </w:pPr>
+      <w:r>
+        <w:rPr>
+          <w:rFonts w:ascii="Times New Roman" w:hAnsi="Times New Roman"/>
+          <w:b/>
+          <w:i/>
+          <w:color w:val="334155"/>
+          <w:sz w:val="21"/>
+        </w:rPr>
+        <w:t>Figure 5: Git Branches &amp; Gitflow Hierarchy Structure</w:t>
+      </w:r>
+    </w:p>
+    <w:p>
+      <w:pPr>
+        <w:spacing w:line="324" w:lineRule="auto" w:after="200"/>
+        <w:jc w:val="both"/>
+      </w:pPr>
+      <w:r>
+        <w:rPr>
+          <w:rFonts w:ascii="Times New Roman" w:hAnsi="Times New Roman"/>
+          <w:b/>
+          <w:color w:val="0F172A"/>
+          <w:sz w:val="24"/>
+        </w:rPr>
+        <w:t xml:space="preserve">Figure 5 Explanation: </w:t>
+      </w:r>
+      <w:r>
+        <w:rPr>
+          <w:rFonts w:ascii="Times New Roman" w:hAnsi="Times New Roman"/>
+          <w:color w:val="1E293B"/>
+          <w:sz w:val="24"/>
+        </w:rPr>
+        <w:t>The Git Branches view displays the five active repository branches: main (production baseline), develop (continuous integration), feature/multi-developer-collab (4-member team module work), bugfix/demo-calc-failure (targeted defect isolation), and release/v1.0.0 (production candidate). It includes the visual Gitflow architectural diagram showing branch lane separation and promotional flow.</w:t>
+      </w:r>
+    </w:p>
+    <w:p>
+      <w:pPr>
+        <w:keepNext/>
+        <w:spacing w:before="160" w:after="80"/>
+        <w:jc w:val="center"/>
+      </w:pPr>
+      <w:r>
+        <w:drawing>
+          <wp:inline xmlns:a="http://schemas.openxmlformats.org/drawingml/2006/main" xmlns:pic="http://schemas.openxmlformats.org/drawingml/2006/picture">
+            <wp:extent cx="5486400" cy="3388659"/>
+            <wp:docPr id="6" name="Picture 6"/>
+            <wp:cNvGraphicFramePr>
+              <a:graphicFrameLocks noChangeAspect="1"/>
+            </wp:cNvGraphicFramePr>
+            <a:graphic>
+              <a:graphicData uri="http://schemas.openxmlformats.org/drawingml/2006/picture">
+                <pic:pic>
+                  <pic:nvPicPr>
+                    <pic:cNvPr id="0" name="git_04_network_graph.png"/>
+                    <pic:cNvPicPr/>
+                  </pic:nvPicPr>
+                  <pic:blipFill>
+                    <a:blip r:embed="rId15"/>
+                    <a:stretch>
+                      <a:fillRect/>
+                    </a:stretch>
+                  </pic:blipFill>
+                  <pic:spPr>
+                    <a:xfrm>
+                      <a:off x="0" y="0"/>
+                      <a:ext cx="5486400" cy="3388659"/>
+                    </a:xfrm>
+                    <a:prstGeom prst="rect"/>
+                  </pic:spPr>
+                </pic:pic>
+              </a:graphicData>
+            </a:graphic>
+          </wp:inline>
+        </w:drawing>
+      </w:r>
+    </w:p>
+    <w:p>
+      <w:pPr>
+        <w:keepNext/>
+        <w:spacing w:before="40" w:after="120"/>
+        <w:jc w:val="center"/>
+      </w:pPr>
+      <w:r>
+        <w:rPr>
+          <w:rFonts w:ascii="Times New Roman" w:hAnsi="Times New Roman"/>
+          <w:b/>
+          <w:i/>
+          <w:color w:val="334155"/>
+          <w:sz w:val="21"/>
+        </w:rPr>
+        <w:t>Figure 6: GitHub Visual Commit Tree &amp; Network Graph (DAG)</w:t>
+      </w:r>
+    </w:p>
+    <w:p>
+      <w:pPr>
+        <w:spacing w:line="324" w:lineRule="auto" w:after="200"/>
+        <w:jc w:val="both"/>
+      </w:pPr>
+      <w:r>
+        <w:rPr>
+          <w:rFonts w:ascii="Times New Roman" w:hAnsi="Times New Roman"/>
+          <w:b/>
+          <w:color w:val="0F172A"/>
+          <w:sz w:val="24"/>
+        </w:rPr>
+        <w:t xml:space="preserve">Figure 6 Explanation: </w:t>
+      </w:r>
+      <w:r>
+        <w:rPr>
+          <w:rFonts w:ascii="Times New Roman" w:hAnsi="Times New Roman"/>
+          <w:color w:val="1E293B"/>
+          <w:sz w:val="24"/>
+        </w:rPr>
+        <w:t>The Visual Commit Network Graph displays the directed acyclic graph (DAG) of the repository. It illustrates parallel branch development, commit nodes from each developer, branch divergence from develop, bugfix branch isolation for defect BUG-024, merge commits (0814589, 74aa410, 7e43c78), and official release tags (v1.0.0).</w:t>
+      </w:r>
+    </w:p>
+    <w:p>
+      <w:pPr>
+        <w:keepNext/>
+        <w:spacing w:before="160" w:after="80"/>
+        <w:jc w:val="center"/>
+      </w:pPr>
+      <w:r>
+        <w:drawing>
+          <wp:inline xmlns:a="http://schemas.openxmlformats.org/drawingml/2006/main" xmlns:pic="http://schemas.openxmlformats.org/drawingml/2006/picture">
+            <wp:extent cx="5486400" cy="3469341"/>
+            <wp:docPr id="7" name="Picture 7"/>
+            <wp:cNvGraphicFramePr>
+              <a:graphicFrameLocks noChangeAspect="1"/>
+            </wp:cNvGraphicFramePr>
+            <a:graphic>
+              <a:graphicData uri="http://schemas.openxmlformats.org/drawingml/2006/picture">
+                <pic:pic>
+                  <pic:nvPicPr>
+                    <pic:cNvPr id="0" name="git_05_pr_review_diff.png"/>
+                    <pic:cNvPicPr/>
+                  </pic:nvPicPr>
+                  <pic:blipFill>
+                    <a:blip r:embed="rId16"/>
+                    <a:stretch>
+                      <a:fillRect/>
+                    </a:stretch>
+                  </pic:blipFill>
+                  <pic:spPr>
+                    <a:xfrm>
+                      <a:off x="0" y="0"/>
+                      <a:ext cx="5486400" cy="3469341"/>
+                    </a:xfrm>
+                    <a:prstGeom prst="rect"/>
+                  </pic:spPr>
+                </pic:pic>
+              </a:graphicData>
+            </a:graphic>
+          </wp:inline>
+        </w:drawing>
+      </w:r>
+    </w:p>
+    <w:p>
+      <w:pPr>
+        <w:keepNext/>
+        <w:spacing w:before="40" w:after="120"/>
+        <w:jc w:val="center"/>
+      </w:pPr>
+      <w:r>
+        <w:rPr>
+          <w:rFonts w:ascii="Times New Roman" w:hAnsi="Times New Roman"/>
+          <w:b/>
+          <w:i/>
+          <w:color w:val="334155"/>
+          <w:sz w:val="21"/>
+        </w:rPr>
+        <w:t>Figure 7: GitHub Pull Request Review, CI Gate Status &amp; Unified Code Diff</w:t>
+      </w:r>
+    </w:p>
+    <w:p>
+      <w:pPr>
+        <w:spacing w:line="324" w:lineRule="auto" w:after="200"/>
+        <w:jc w:val="both"/>
+      </w:pPr>
+      <w:r>
+        <w:rPr>
+          <w:rFonts w:ascii="Times New Roman" w:hAnsi="Times New Roman"/>
+          <w:b/>
+          <w:color w:val="0F172A"/>
+          <w:sz w:val="24"/>
+        </w:rPr>
+        <w:t xml:space="preserve">Figure 7 Explanation: </w:t>
+      </w:r>
+      <w:r>
+        <w:rPr>
+          <w:rFonts w:ascii="Times New Roman" w:hAnsi="Times New Roman"/>
+          <w:color w:val="1E293B"/>
+          <w:sz w:val="24"/>
+        </w:rPr>
+        <w:t>The Pull Request interface for PR #4 demonstrates formal SCM gate enforcement. It showcases verified CI test pass status, peer code review approval from Bharathwaraj K S (CCB), and the unified code diff in Calculator.java and ReportService.java showing exact line additions (+) and deletions (-) resolving the defect.</w:t>
+      </w:r>
+    </w:p>
+    <w:p>
+      <w:pPr>
+        <w:keepNext/>
+        <w:spacing w:before="160" w:after="80"/>
+        <w:jc w:val="center"/>
+      </w:pPr>
+      <w:r>
+        <w:drawing>
+          <wp:inline xmlns:a="http://schemas.openxmlformats.org/drawingml/2006/main" xmlns:pic="http://schemas.openxmlformats.org/drawingml/2006/picture">
+            <wp:extent cx="5486400" cy="3550024"/>
+            <wp:docPr id="8" name="Picture 8"/>
+            <wp:cNvGraphicFramePr>
+              <a:graphicFrameLocks noChangeAspect="1"/>
+            </wp:cNvGraphicFramePr>
+            <a:graphic>
+              <a:graphicData uri="http://schemas.openxmlformats.org/drawingml/2006/picture">
+                <pic:pic>
+                  <pic:nvPicPr>
+                    <pic:cNvPr id="0" name="git_06_release_tags.png"/>
+                    <pic:cNvPicPr/>
+                  </pic:nvPicPr>
+                  <pic:blipFill>
+                    <a:blip r:embed="rId17"/>
+                    <a:stretch>
+                      <a:fillRect/>
+                    </a:stretch>
+                  </pic:blipFill>
+                  <pic:spPr>
+                    <a:xfrm>
+                      <a:off x="0" y="0"/>
+                      <a:ext cx="5486400" cy="3550024"/>
+                    </a:xfrm>
+                    <a:prstGeom prst="rect"/>
+                  </pic:spPr>
+                </pic:pic>
+              </a:graphicData>
+            </a:graphic>
+          </wp:inline>
+        </w:drawing>
+      </w:r>
+    </w:p>
+    <w:p>
+      <w:pPr>
+        <w:keepNext/>
+        <w:spacing w:before="40" w:after="120"/>
+        <w:jc w:val="center"/>
+      </w:pPr>
+      <w:r>
+        <w:rPr>
+          <w:rFonts w:ascii="Times New Roman" w:hAnsi="Times New Roman"/>
+          <w:b/>
+          <w:i/>
+          <w:color w:val="334155"/>
+          <w:sz w:val="21"/>
+        </w:rPr>
+        <w:t>Figure 8: GitHub Releases, Semantic Tags &amp; Official Baseline Manifests</w:t>
+      </w:r>
+    </w:p>
+    <w:p>
+      <w:pPr>
+        <w:spacing w:line="324" w:lineRule="auto" w:after="200"/>
+        <w:jc w:val="both"/>
+      </w:pPr>
+      <w:r>
+        <w:rPr>
+          <w:rFonts w:ascii="Times New Roman" w:hAnsi="Times New Roman"/>
+          <w:b/>
+          <w:color w:val="0F172A"/>
+          <w:sz w:val="24"/>
+        </w:rPr>
+        <w:t xml:space="preserve">Figure 8 Explanation: </w:t>
+      </w:r>
+      <w:r>
+        <w:rPr>
+          <w:rFonts w:ascii="Times New Roman" w:hAnsi="Times New Roman"/>
+          <w:color w:val="1E293B"/>
+          <w:sz w:val="24"/>
+        </w:rPr>
+        <w:t>The GitHub Releases register documents official Configuration Baselines: Release v1.0.0 (Baseline BL-05), v0.2.0 (Baseline BL-04), and v0.1.0 (Baseline BL-01). It highlights signed release notes, commit hash bindings, FCA/PCA audit compliance, and packaged binary distribution assets (JAR, manifest JSON, and SHA-256 checksums).</w:t>
+      </w:r>
+    </w:p>
+    <w:p>
+      <w:pPr>
+        <w:keepNext/>
+        <w:spacing w:before="160" w:after="80"/>
+        <w:jc w:val="center"/>
+      </w:pPr>
+      <w:r>
+        <w:drawing>
+          <wp:inline xmlns:a="http://schemas.openxmlformats.org/drawingml/2006/main" xmlns:pic="http://schemas.openxmlformats.org/drawingml/2006/picture">
+            <wp:extent cx="5486400" cy="3114278"/>
+            <wp:docPr id="9" name="Picture 9"/>
+            <wp:cNvGraphicFramePr>
+              <a:graphicFrameLocks noChangeAspect="1"/>
+            </wp:cNvGraphicFramePr>
+            <a:graphic>
+              <a:graphicData uri="http://schemas.openxmlformats.org/drawingml/2006/picture">
+                <pic:pic>
+                  <pic:nvPicPr>
+                    <pic:cNvPr id="0" name="fig07_baselines_versions.png"/>
+                    <pic:cNvPicPr/>
+                  </pic:nvPicPr>
+                  <pic:blipFill>
+                    <a:blip r:embed="rId18"/>
+                    <a:stretch>
+                      <a:fillRect/>
+                    </a:stretch>
+                  </pic:blipFill>
+                  <pic:spPr>
+                    <a:xfrm>
+                      <a:off x="0" y="0"/>
+                      <a:ext cx="5486400" cy="3114278"/>
+                    </a:xfrm>
+                    <a:prstGeom prst="rect"/>
+                  </pic:spPr>
+                </pic:pic>
+              </a:graphicData>
+            </a:graphic>
+          </wp:inline>
+        </w:drawing>
+      </w:r>
+    </w:p>
+    <w:p>
+      <w:pPr>
+        <w:keepNext/>
+        <w:spacing w:before="40" w:after="120"/>
+        <w:jc w:val="center"/>
+      </w:pPr>
+      <w:r>
+        <w:rPr>
+          <w:rFonts w:ascii="Times New Roman" w:hAnsi="Times New Roman"/>
+          <w:b/>
+          <w:i/>
+          <w:color w:val="334155"/>
+          <w:sz w:val="21"/>
+        </w:rPr>
+        <w:t>Figure 9: CommitSleuth Web Application Baselines Register</w:t>
+      </w:r>
+    </w:p>
+    <w:p>
+      <w:pPr>
+        <w:spacing w:line="324" w:lineRule="auto" w:after="200"/>
+        <w:jc w:val="both"/>
+      </w:pPr>
+      <w:r>
+        <w:rPr>
+          <w:rFonts w:ascii="Times New Roman" w:hAnsi="Times New Roman"/>
+          <w:b/>
+          <w:color w:val="0F172A"/>
+          <w:sz w:val="24"/>
+        </w:rPr>
+        <w:t xml:space="preserve">Figure 9 Explanation: </w:t>
+      </w:r>
+      <w:r>
+        <w:rPr>
+          <w:rFonts w:ascii="Times New Roman" w:hAnsi="Times New Roman"/>
+          <w:color w:val="1E293B"/>
+          <w:sz w:val="24"/>
+        </w:rPr>
+        <w:t>The Baselines and Version Management interface in the CommitSleuth web portal displays approved configuration baselines (BL-01 through BL-05), their semantic versions, Git release tags, commit hashes, approval dates, and baseline comparison tools tracking configuration item deltas.</w:t>
+      </w:r>
+    </w:p>
+    <w:p>
+      <w:pPr>
+        <w:keepNext/>
+        <w:spacing w:before="360" w:after="120"/>
       </w:pPr>
       <w:r>
         <w:rPr>
@@ -813,7 +4061,7 @@
           <w:color w:val="1E293B"/>
           <w:sz w:val="24"/>
         </w:rPr>
-        <w:t>The project tracks ten formal Change Requests (CR-001 through CR-010). Each change request record documents the unique CR identifier, descriptive title, requester, technical rationale, affected configuration items, priority, target branch, and CCB decision status (Raised, Under Review, Approved, Implemented, or Rejected). For example, CR-009 represents Karthik's modification to monthly expense calculations in ReportService.java on feature/reports, while CR-010 represents the subsequent corrective fix restoring build health. The web interface enables authorized developers to register new change requests while enforcing role permissions so that only CCB administrators can record official approval decisions.</w:t>
+        <w:t>The project tracks sixteen formal Change Requests (CR-001 through CR-016). Each change request record documents the unique CR identifier, descriptive title, requester, technical rationale, affected configuration items, priority, target branch, and CCB decision status (Raised, Under Review, Approved, Implemented, or Rejected). For example, CR-009 represents the controlled defect injection and subsequent fix in Calculator.java on bugfix/demo-calc-failure, while CR-014 represents multi-developer collaborative integration. The web interface enables authorized developers to register new change requests while enforcing role permissions so that only CCB administrators can record official approval decisions.</w:t>
       </w:r>
     </w:p>
     <w:p>
@@ -825,8 +4073,8 @@
       <w:r>
         <w:drawing>
           <wp:inline xmlns:a="http://schemas.openxmlformats.org/drawingml/2006/main" xmlns:pic="http://schemas.openxmlformats.org/drawingml/2006/picture">
-            <wp:extent cx="5440680" cy="3088325"/>
-            <wp:docPr id="3" name="Picture 3"/>
+            <wp:extent cx="5486400" cy="3114278"/>
+            <wp:docPr id="10" name="Picture 10"/>
             <wp:cNvGraphicFramePr>
               <a:graphicFrameLocks noChangeAspect="1"/>
             </wp:cNvGraphicFramePr>
@@ -838,7 +4086,7 @@
                     <pic:cNvPicPr/>
                   </pic:nvPicPr>
                   <pic:blipFill>
-                    <a:blip r:embed="rId12"/>
+                    <a:blip r:embed="rId19"/>
                     <a:stretch>
                       <a:fillRect/>
                     </a:stretch>
@@ -846,7 +4094,7 @@
                   <pic:spPr>
                     <a:xfrm>
                       <a:off x="0" y="0"/>
-                      <a:ext cx="5440680" cy="3088325"/>
+                      <a:ext cx="5486400" cy="3114278"/>
                     </a:xfrm>
                     <a:prstGeom prst="rect"/>
                   </pic:spPr>
@@ -871,7 +4119,7 @@
           <w:color w:val="334155"/>
           <w:sz w:val="21"/>
         </w:rPr>
-        <w:t>Figure 3: SCM Change Management Register</w:t>
+        <w:t>Figure 10: SCM Change Management Register &amp; CCB Review Portal</w:t>
       </w:r>
     </w:p>
     <w:p>
@@ -886,7 +4134,7 @@
           <w:color w:val="0F172A"/>
           <w:sz w:val="24"/>
         </w:rPr>
-        <w:t xml:space="preserve">Figure 3 Explanation: </w:t>
+        <w:t xml:space="preserve">Figure 10 Explanation: </w:t>
       </w:r>
       <w:r>
         <w:rPr>
@@ -894,13 +4142,13 @@
           <w:color w:val="1E293B"/>
           <w:sz w:val="24"/>
         </w:rPr>
-        <w:t>The Change Management register displays the formal ledger of Change Requests (CR-001 through CR-010), including requester identities, scope of impact, priority levels, CCB review statuses, target branches, and associated Git commit hashes, ensuring complete auditability from requirement change to code commit.</w:t>
+        <w:t>The Change Management register displays the formal ledger of Change Requests, including requester identities, scope of impact, priority levels, CCB review statuses, target branches, and associated Git commit hashes, ensuring complete auditability from requirement change to code commit.</w:t>
       </w:r>
     </w:p>
     <w:p>
       <w:pPr>
         <w:keepNext/>
-        <w:spacing w:before="320" w:after="120"/>
+        <w:spacing w:before="360" w:after="120"/>
       </w:pPr>
       <w:r>
         <w:rPr>
@@ -937,7 +4185,7 @@
           <w:color w:val="1E293B"/>
           <w:sz w:val="24"/>
         </w:rPr>
-        <w:t>In the central demonstration scenario, Build #128 fails due to an intentional defect introduced by Karthik in ReportService.java, causing ReportServiceTest to fail with an AssertionFailedError. CommitSleuth attributes this failure to Karthik's commit (a91bc42) with 88.5% confidence and automatically creates problem record BUG-024. The problem record progresses through a formal SCM lifecycle: Open -&gt; Investigating -&gt; Fix Submitted -&gt; Verification Pending -&gt; Resolved. A defect cannot be prematurely closed by simple assertion; it transitions to Resolved only after a subsequent verification build (Build #129) successfully compiles and passes all unit tests.</w:t>
+        <w:t>In the central demonstration scenario, Build #128 fails due to a defect introduced in Calculator.java, causing CalculatorTest to fail with an AssertionFailedError. CommitSleuth attributes this failure to candidate commit 9297e33 with 88.5% confidence and automatically creates problem record BUG-024. The problem record progresses through a formal SCM lifecycle: Open -&gt; Investigating -&gt; Fix Submitted -&gt; Verification Pending -&gt; Resolved. A defect cannot be prematurely closed by simple assertion; it transitions to Resolved only after a subsequent verification build (Build #129) successfully compiles and passes all unit tests.</w:t>
       </w:r>
     </w:p>
     <w:p>
@@ -949,8 +4197,8 @@
       <w:r>
         <w:drawing>
           <wp:inline xmlns:a="http://schemas.openxmlformats.org/drawingml/2006/main" xmlns:pic="http://schemas.openxmlformats.org/drawingml/2006/picture">
-            <wp:extent cx="5440680" cy="3088325"/>
-            <wp:docPr id="4" name="Picture 4"/>
+            <wp:extent cx="5486400" cy="3114278"/>
+            <wp:docPr id="11" name="Picture 11"/>
             <wp:cNvGraphicFramePr>
               <a:graphicFrameLocks noChangeAspect="1"/>
             </wp:cNvGraphicFramePr>
@@ -962,7 +4210,7 @@
                     <pic:cNvPicPr/>
                   </pic:nvPicPr>
                   <pic:blipFill>
-                    <a:blip r:embed="rId13"/>
+                    <a:blip r:embed="rId20"/>
                     <a:stretch>
                       <a:fillRect/>
                     </a:stretch>
@@ -970,7 +4218,7 @@
                   <pic:spPr>
                     <a:xfrm>
                       <a:off x="0" y="0"/>
-                      <a:ext cx="5440680" cy="3088325"/>
+                      <a:ext cx="5486400" cy="3114278"/>
                     </a:xfrm>
                     <a:prstGeom prst="rect"/>
                   </pic:spPr>
@@ -995,7 +4243,7 @@
           <w:color w:val="334155"/>
           <w:sz w:val="21"/>
         </w:rPr>
-        <w:t>Figure 4: Automated Problem Tracking Register</w:t>
+        <w:t>Figure 11: Automated Problem Tracking Register &amp; BUG-024 Incident Ledger</w:t>
       </w:r>
     </w:p>
     <w:p>
@@ -1010,7 +4258,7 @@
           <w:color w:val="0F172A"/>
           <w:sz w:val="24"/>
         </w:rPr>
-        <w:t xml:space="preserve">Figure 4 Explanation: </w:t>
+        <w:t xml:space="preserve">Figure 11 Explanation: </w:t>
       </w:r>
       <w:r>
         <w:rPr>
@@ -1018,13 +4266,94 @@
           <w:color w:val="1E293B"/>
           <w:sz w:val="24"/>
         </w:rPr>
-        <w:t>The Problem Tracking register illustrates the defect ledger, showing unique problem codes (e.g., BUG-024 / P-001), associated failing build numbers, failure categories (test), suspect commit hashes, attribution confidence scores, assigned developers, and real-time lifecycle progression states.</w:t>
+        <w:t>The Problem Tracking register illustrates the defect ledger, showing unique problem codes (e.g., BUG-024), associated failing build numbers, failure categories (test), suspect commit hashes, attribution confidence scores, assigned developers, and real-time lifecycle progression states.</w:t>
       </w:r>
     </w:p>
     <w:p>
       <w:pPr>
         <w:keepNext/>
-        <w:spacing w:before="320" w:after="120"/>
+        <w:spacing w:before="160" w:after="80"/>
+        <w:jc w:val="center"/>
+      </w:pPr>
+      <w:r>
+        <w:drawing>
+          <wp:inline xmlns:a="http://schemas.openxmlformats.org/drawingml/2006/main" xmlns:pic="http://schemas.openxmlformats.org/drawingml/2006/picture">
+            <wp:extent cx="5486400" cy="3114278"/>
+            <wp:docPr id="12" name="Picture 12"/>
+            <wp:cNvGraphicFramePr>
+              <a:graphicFrameLocks noChangeAspect="1"/>
+            </wp:cNvGraphicFramePr>
+            <a:graphic>
+              <a:graphicData uri="http://schemas.openxmlformats.org/drawingml/2006/picture">
+                <pic:pic>
+                  <pic:nvPicPr>
+                    <pic:cNvPr id="0" name="fig04_failure_attribution.png"/>
+                    <pic:cNvPicPr/>
+                  </pic:nvPicPr>
+                  <pic:blipFill>
+                    <a:blip r:embed="rId21"/>
+                    <a:stretch>
+                      <a:fillRect/>
+                    </a:stretch>
+                  </pic:blipFill>
+                  <pic:spPr>
+                    <a:xfrm>
+                      <a:off x="0" y="0"/>
+                      <a:ext cx="5486400" cy="3114278"/>
+                    </a:xfrm>
+                    <a:prstGeom prst="rect"/>
+                  </pic:spPr>
+                </pic:pic>
+              </a:graphicData>
+            </a:graphic>
+          </wp:inline>
+        </w:drawing>
+      </w:r>
+    </w:p>
+    <w:p>
+      <w:pPr>
+        <w:keepNext/>
+        <w:spacing w:before="40" w:after="120"/>
+        <w:jc w:val="center"/>
+      </w:pPr>
+      <w:r>
+        <w:rPr>
+          <w:rFonts w:ascii="Times New Roman" w:hAnsi="Times New Roman"/>
+          <w:b/>
+          <w:i/>
+          <w:color w:val="334155"/>
+          <w:sz w:val="21"/>
+        </w:rPr>
+        <w:t>Figure 12: Web-Enabled Failure Attribution and Root-Cause Diagnostics Interface</w:t>
+      </w:r>
+    </w:p>
+    <w:p>
+      <w:pPr>
+        <w:spacing w:line="324" w:lineRule="auto" w:after="200"/>
+        <w:jc w:val="both"/>
+      </w:pPr>
+      <w:r>
+        <w:rPr>
+          <w:rFonts w:ascii="Times New Roman" w:hAnsi="Times New Roman"/>
+          <w:b/>
+          <w:color w:val="0F172A"/>
+          <w:sz w:val="24"/>
+        </w:rPr>
+        <w:t xml:space="preserve">Figure 12 Explanation: </w:t>
+      </w:r>
+      <w:r>
+        <w:rPr>
+          <w:rFonts w:ascii="Times New Roman" w:hAnsi="Times New Roman"/>
+          <w:color w:val="1E293B"/>
+          <w:sz w:val="24"/>
+        </w:rPr>
+        <w:t>The Failure Attribution web interface demonstrates the interactive root-cause investigation view for Build #128, displaying parsed console output, failing JUnit test assertions, candidate commit ranking breakdown, and automated rollback recommendations.</w:t>
+      </w:r>
+    </w:p>
+    <w:p>
+      <w:pPr>
+        <w:keepNext/>
+        <w:spacing w:before="360" w:after="120"/>
       </w:pPr>
       <w:r>
         <w:rPr>
@@ -1073,8 +4402,8 @@
       <w:r>
         <w:drawing>
           <wp:inline xmlns:a="http://schemas.openxmlformats.org/drawingml/2006/main" xmlns:pic="http://schemas.openxmlformats.org/drawingml/2006/picture">
-            <wp:extent cx="5440680" cy="3088325"/>
-            <wp:docPr id="5" name="Picture 5"/>
+            <wp:extent cx="5486400" cy="3114278"/>
+            <wp:docPr id="13" name="Picture 13"/>
             <wp:cNvGraphicFramePr>
               <a:graphicFrameLocks noChangeAspect="1"/>
             </wp:cNvGraphicFramePr>
@@ -1086,7 +4415,7 @@
                     <pic:cNvPicPr/>
                   </pic:nvPicPr>
                   <pic:blipFill>
-                    <a:blip r:embed="rId14"/>
+                    <a:blip r:embed="rId22"/>
                     <a:stretch>
                       <a:fillRect/>
                     </a:stretch>
@@ -1094,7 +4423,7 @@
                   <pic:spPr>
                     <a:xfrm>
                       <a:off x="0" y="0"/>
-                      <a:ext cx="5440680" cy="3088325"/>
+                      <a:ext cx="5486400" cy="3114278"/>
                     </a:xfrm>
                     <a:prstGeom prst="rect"/>
                   </pic:spPr>
@@ -1119,7 +4448,7 @@
           <w:color w:val="334155"/>
           <w:sz w:val="21"/>
         </w:rPr>
-        <w:t>Figure 5: Promotional Gate Ledger and Quality Gate Evaluation</w:t>
+        <w:t>Figure 13: Promotional Gate Ledger and Quality Gate Evaluation</w:t>
       </w:r>
     </w:p>
     <w:p>
@@ -1134,7 +4463,7 @@
           <w:color w:val="0F172A"/>
           <w:sz w:val="24"/>
         </w:rPr>
-        <w:t xml:space="preserve">Figure 5 Explanation: </w:t>
+        <w:t xml:space="preserve">Figure 13 Explanation: </w:t>
       </w:r>
       <w:r>
         <w:rPr>
@@ -1148,7 +4477,7 @@
     <w:p>
       <w:pPr>
         <w:keepNext/>
-        <w:spacing w:before="320" w:after="120"/>
+        <w:spacing w:before="360" w:after="120"/>
       </w:pPr>
       <w:r>
         <w:rPr>
@@ -1197,8 +4526,8 @@
       <w:r>
         <w:drawing>
           <wp:inline xmlns:a="http://schemas.openxmlformats.org/drawingml/2006/main" xmlns:pic="http://schemas.openxmlformats.org/drawingml/2006/picture">
-            <wp:extent cx="5440680" cy="3088325"/>
-            <wp:docPr id="6" name="Picture 6"/>
+            <wp:extent cx="5486400" cy="3114278"/>
+            <wp:docPr id="14" name="Picture 14"/>
             <wp:cNvGraphicFramePr>
               <a:graphicFrameLocks noChangeAspect="1"/>
             </wp:cNvGraphicFramePr>
@@ -1210,7 +4539,7 @@
                     <pic:cNvPicPr/>
                   </pic:nvPicPr>
                   <pic:blipFill>
-                    <a:blip r:embed="rId15"/>
+                    <a:blip r:embed="rId23"/>
                     <a:stretch>
                       <a:fillRect/>
                     </a:stretch>
@@ -1218,7 +4547,7 @@
                   <pic:spPr>
                     <a:xfrm>
                       <a:off x="0" y="0"/>
-                      <a:ext cx="5440680" cy="3088325"/>
+                      <a:ext cx="5486400" cy="3114278"/>
                     </a:xfrm>
                     <a:prstGeom prst="rect"/>
                   </pic:spPr>
@@ -1243,7 +4572,7 @@
           <w:color w:val="334155"/>
           <w:sz w:val="21"/>
         </w:rPr>
-        <w:t>Figure 6: Configuration Item (CI) Register</w:t>
+        <w:t>Figure 14: Configuration Item (CI) Register &amp; Lifecycle Ledger</w:t>
       </w:r>
     </w:p>
     <w:p>
@@ -1258,7 +4587,7 @@
           <w:color w:val="0F172A"/>
           <w:sz w:val="24"/>
         </w:rPr>
-        <w:t xml:space="preserve">Figure 6 Explanation: </w:t>
+        <w:t xml:space="preserve">Figure 14 Explanation: </w:t>
       </w:r>
       <w:r>
         <w:rPr>
@@ -1278,8 +4607,8 @@
       <w:r>
         <w:drawing>
           <wp:inline xmlns:a="http://schemas.openxmlformats.org/drawingml/2006/main" xmlns:pic="http://schemas.openxmlformats.org/drawingml/2006/picture">
-            <wp:extent cx="5440680" cy="3088325"/>
-            <wp:docPr id="7" name="Picture 7"/>
+            <wp:extent cx="5486400" cy="3114278"/>
+            <wp:docPr id="15" name="Picture 15"/>
             <wp:cNvGraphicFramePr>
               <a:graphicFrameLocks noChangeAspect="1"/>
             </wp:cNvGraphicFramePr>
@@ -1291,7 +4620,7 @@
                     <pic:cNvPicPr/>
                   </pic:nvPicPr>
                   <pic:blipFill>
-                    <a:blip r:embed="rId16"/>
+                    <a:blip r:embed="rId24"/>
                     <a:stretch>
                       <a:fillRect/>
                     </a:stretch>
@@ -1299,7 +4628,7 @@
                   <pic:spPr>
                     <a:xfrm>
                       <a:off x="0" y="0"/>
-                      <a:ext cx="5440680" cy="3088325"/>
+                      <a:ext cx="5486400" cy="3114278"/>
                     </a:xfrm>
                     <a:prstGeom prst="rect"/>
                   </pic:spPr>
@@ -1324,7 +4653,7 @@
           <w:color w:val="334155"/>
           <w:sz w:val="21"/>
         </w:rPr>
-        <w:t>Figure 7: Configuration Status Accounting Report (CSAR) Output</w:t>
+        <w:t>Figure 15: Configuration Status Accounting Report (CSAR) Output View</w:t>
       </w:r>
     </w:p>
     <w:p>
@@ -1339,7 +4668,7 @@
           <w:color w:val="0F172A"/>
           <w:sz w:val="24"/>
         </w:rPr>
-        <w:t xml:space="preserve">Figure 7 Explanation: </w:t>
+        <w:t xml:space="preserve">Figure 15 Explanation: </w:t>
       </w:r>
       <w:r>
         <w:rPr>
@@ -1353,7 +4682,7 @@
     <w:p>
       <w:pPr>
         <w:keepNext/>
-        <w:spacing w:before="320" w:after="120"/>
+        <w:spacing w:before="360" w:after="120"/>
       </w:pPr>
       <w:r>
         <w:rPr>
@@ -1406,8 +4735,8 @@
       <w:r>
         <w:drawing>
           <wp:inline xmlns:a="http://schemas.openxmlformats.org/drawingml/2006/main" xmlns:pic="http://schemas.openxmlformats.org/drawingml/2006/picture">
-            <wp:extent cx="5440680" cy="3088325"/>
-            <wp:docPr id="8" name="Picture 8"/>
+            <wp:extent cx="5486400" cy="3114278"/>
+            <wp:docPr id="16" name="Picture 16"/>
             <wp:cNvGraphicFramePr>
               <a:graphicFrameLocks noChangeAspect="1"/>
             </wp:cNvGraphicFramePr>
@@ -1419,7 +4748,7 @@
                     <pic:cNvPicPr/>
                   </pic:nvPicPr>
                   <pic:blipFill>
-                    <a:blip r:embed="rId17"/>
+                    <a:blip r:embed="rId25"/>
                     <a:stretch>
                       <a:fillRect/>
                     </a:stretch>
@@ -1427,7 +4756,7 @@
                   <pic:spPr>
                     <a:xfrm>
                       <a:off x="0" y="0"/>
-                      <a:ext cx="5440680" cy="3088325"/>
+                      <a:ext cx="5486400" cy="3114278"/>
                     </a:xfrm>
                     <a:prstGeom prst="rect"/>
                   </pic:spPr>
@@ -1452,7 +4781,7 @@
           <w:color w:val="334155"/>
           <w:sz w:val="21"/>
         </w:rPr>
-        <w:t>Figure 8: Configuration Auditing System (FCA &amp; PCA Ledger)</w:t>
+        <w:t>Figure 16: Configuration Auditing System (FCA &amp; PCA Observations Ledger)</w:t>
       </w:r>
     </w:p>
     <w:p>
@@ -1467,7 +4796,7 @@
           <w:color w:val="0F172A"/>
           <w:sz w:val="24"/>
         </w:rPr>
-        <w:t xml:space="preserve">Figure 8 Explanation: </w:t>
+        <w:t xml:space="preserve">Figure 16 Explanation: </w:t>
       </w:r>
       <w:r>
         <w:rPr>
@@ -1481,7 +4810,7 @@
     <w:p>
       <w:pPr>
         <w:keepNext/>
-        <w:spacing w:before="320" w:after="120"/>
+        <w:spacing w:before="360" w:after="120"/>
       </w:pPr>
       <w:r>
         <w:rPr>
@@ -1538,8 +4867,8 @@
       <w:r>
         <w:drawing>
           <wp:inline xmlns:a="http://schemas.openxmlformats.org/drawingml/2006/main" xmlns:pic="http://schemas.openxmlformats.org/drawingml/2006/picture">
-            <wp:extent cx="5440680" cy="3088325"/>
-            <wp:docPr id="9" name="Picture 9"/>
+            <wp:extent cx="5486400" cy="3114278"/>
+            <wp:docPr id="17" name="Picture 17"/>
             <wp:cNvGraphicFramePr>
               <a:graphicFrameLocks noChangeAspect="1"/>
             </wp:cNvGraphicFramePr>
@@ -1551,7 +4880,7 @@
                     <pic:cNvPicPr/>
                   </pic:nvPicPr>
                   <pic:blipFill>
-                    <a:blip r:embed="rId18"/>
+                    <a:blip r:embed="rId26"/>
                     <a:stretch>
                       <a:fillRect/>
                     </a:stretch>
@@ -1559,7 +4888,7 @@
                   <pic:spPr>
                     <a:xfrm>
                       <a:off x="0" y="0"/>
-                      <a:ext cx="5440680" cy="3088325"/>
+                      <a:ext cx="5486400" cy="3114278"/>
                     </a:xfrm>
                     <a:prstGeom prst="rect"/>
                   </pic:spPr>
@@ -1584,7 +4913,7 @@
           <w:color w:val="334155"/>
           <w:sz w:val="21"/>
         </w:rPr>
-        <w:t>Figure 9: Access Control and SCM Security Audit Trail</w:t>
+        <w:t>Figure 17: Access Control and SCM Security Audit Trail</w:t>
       </w:r>
     </w:p>
     <w:p>
@@ -1599,7 +4928,7 @@
           <w:color w:val="0F172A"/>
           <w:sz w:val="24"/>
         </w:rPr>
-        <w:t xml:space="preserve">Figure 9 Explanation: </w:t>
+        <w:t xml:space="preserve">Figure 17 Explanation: </w:t>
       </w:r>
       <w:r>
         <w:rPr>
@@ -1613,7 +4942,7 @@
     <w:p>
       <w:pPr>
         <w:keepNext/>
-        <w:spacing w:before="320" w:after="120"/>
+        <w:spacing w:before="360" w:after="120"/>
       </w:pPr>
       <w:r>
         <w:rPr>
@@ -1652,7 +4981,7 @@
         </w:rPr>
         <w:t>The heuristic engine evaluates candidate commits against four configurable factors:</w:t>
         <w:br/>
-        <w:t>1. File Match Weight (default 0.55): Evaluates direct name matching between candidate changeset files and classes referenced in failing test traces (e.g., matching ReportService.java with ReportServiceTest).</w:t>
+        <w:t>1. File Match Weight (default 0.55): Evaluates direct name matching between candidate changeset files and classes referenced in failing test traces (e.g., matching Calculator.java with CalculatorTest).</w:t>
         <w:br/>
         <w:t>2. Dependency Change Weight (default 0.25): Assigns weight to pom.xml modifications when a dependency resolution failure occurs.</w:t>
         <w:br/>
@@ -1672,8 +5001,8 @@
       <w:r>
         <w:drawing>
           <wp:inline xmlns:a="http://schemas.openxmlformats.org/drawingml/2006/main" xmlns:pic="http://schemas.openxmlformats.org/drawingml/2006/picture">
-            <wp:extent cx="5440680" cy="3088325"/>
-            <wp:docPr id="10" name="Picture 10"/>
+            <wp:extent cx="5486400" cy="3114278"/>
+            <wp:docPr id="18" name="Picture 18"/>
             <wp:cNvGraphicFramePr>
               <a:graphicFrameLocks noChangeAspect="1"/>
             </wp:cNvGraphicFramePr>
@@ -1685,7 +5014,7 @@
                     <pic:cNvPicPr/>
                   </pic:nvPicPr>
                   <pic:blipFill>
-                    <a:blip r:embed="rId19"/>
+                    <a:blip r:embed="rId27"/>
                     <a:stretch>
                       <a:fillRect/>
                     </a:stretch>
@@ -1693,7 +5022,7 @@
                   <pic:spPr>
                     <a:xfrm>
                       <a:off x="0" y="0"/>
-                      <a:ext cx="5440680" cy="3088325"/>
+                      <a:ext cx="5486400" cy="3114278"/>
                     </a:xfrm>
                     <a:prstGeom prst="rect"/>
                   </pic:spPr>
@@ -1718,7 +5047,7 @@
           <w:color w:val="334155"/>
           <w:sz w:val="21"/>
         </w:rPr>
-        <w:t>Figure 10: SCM Customization and Heuristic Weight Configuration</w:t>
+        <w:t>Figure 18: SCM Customization and Heuristic Weight Configuration</w:t>
       </w:r>
     </w:p>
     <w:p>
@@ -1733,7 +5062,7 @@
           <w:color w:val="0F172A"/>
           <w:sz w:val="24"/>
         </w:rPr>
-        <w:t xml:space="preserve">Figure 10 Explanation: </w:t>
+        <w:t xml:space="preserve">Figure 18 Explanation: </w:t>
       </w:r>
       <w:r>
         <w:rPr>
@@ -1747,7 +5076,7 @@
     <w:p>
       <w:pPr>
         <w:keepNext/>
-        <w:spacing w:before="320" w:after="120"/>
+        <w:spacing w:before="360" w:after="120"/>
       </w:pPr>
       <w:r>
         <w:rPr>
@@ -1784,7 +5113,7 @@
           <w:color w:val="1E293B"/>
           <w:sz w:val="24"/>
         </w:rPr>
-        <w:t>Operating as a Flask WSGI service on port 5000, CommitSleuth provides thirteen responsive views covering the entire SCM lifecycle. In particular, the failure investigation module (/failures/&lt;id&gt;) offers an interactive terminal console viewer with color-coded log lines, highlighting JUnit assertions and failure traces in red. The interface presents a structured root-cause card, an evidence breakdown showing mathematical score contributions, and side-by-side code diff suggestions showing developers exactly how to resolve the defect. Authenticated REST APIs (/api/builds, /api/demo/run-failure, /api/demo/run-fix) further web-enable the platform for automated integration with CI servers.</w:t>
+        <w:t>Operating as a Flask WSGI service on port 5000, CommitSleuth provides thirteen responsive views covering the entire SCM lifecycle. In particular, the CI/CD build history module (/builds) offers an interactive build matrix detailing pipeline executions across branches, commit authors, test outcomes, and attribution links. Authenticated REST APIs (/api/builds, /api/demo/run-failure, /api/demo/run-fix) further web-enable the platform for automated integration with CI servers.</w:t>
       </w:r>
     </w:p>
     <w:p>
@@ -1796,8 +5125,8 @@
       <w:r>
         <w:drawing>
           <wp:inline xmlns:a="http://schemas.openxmlformats.org/drawingml/2006/main" xmlns:pic="http://schemas.openxmlformats.org/drawingml/2006/picture">
-            <wp:extent cx="5440680" cy="3088325"/>
-            <wp:docPr id="11" name="Picture 11"/>
+            <wp:extent cx="5486400" cy="3114278"/>
+            <wp:docPr id="19" name="Picture 19"/>
             <wp:cNvGraphicFramePr>
               <a:graphicFrameLocks noChangeAspect="1"/>
             </wp:cNvGraphicFramePr>
@@ -1805,11 +5134,11 @@
               <a:graphicData uri="http://schemas.openxmlformats.org/drawingml/2006/picture">
                 <pic:pic>
                   <pic:nvPicPr>
-                    <pic:cNvPr id="0" name="fig04_failure_attribution.png"/>
+                    <pic:cNvPr id="0" name="fig02_build_history.png"/>
                     <pic:cNvPicPr/>
                   </pic:nvPicPr>
                   <pic:blipFill>
-                    <a:blip r:embed="rId20"/>
+                    <a:blip r:embed="rId28"/>
                     <a:stretch>
                       <a:fillRect/>
                     </a:stretch>
@@ -1817,7 +5146,7 @@
                   <pic:spPr>
                     <a:xfrm>
                       <a:off x="0" y="0"/>
-                      <a:ext cx="5440680" cy="3088325"/>
+                      <a:ext cx="5486400" cy="3114278"/>
                     </a:xfrm>
                     <a:prstGeom prst="rect"/>
                   </pic:spPr>
@@ -1842,7 +5171,7 @@
           <w:color w:val="334155"/>
           <w:sz w:val="21"/>
         </w:rPr>
-        <w:t>Figure 11: Web-Enabled Failure Attribution and Root-Cause Analysis Interface</w:t>
+        <w:t>Figure 19: Web-Enabled CI/CD Build History &amp; Failure Matrix</w:t>
       </w:r>
     </w:p>
     <w:p>
@@ -1857,7 +5186,7 @@
           <w:color w:val="0F172A"/>
           <w:sz w:val="24"/>
         </w:rPr>
-        <w:t xml:space="preserve">Figure 11 Explanation: </w:t>
+        <w:t xml:space="preserve">Figure 19 Explanation: </w:t>
       </w:r>
       <w:r>
         <w:rPr>
@@ -1865,13 +5194,13 @@
           <w:color w:val="1E293B"/>
           <w:sz w:val="24"/>
         </w:rPr>
-        <w:t>The Failure Attribution web interface demonstrates the interactive root-cause investigation view for Build #128, displaying parsed console output, failing JUnit test assertions, candidate commit ranking breakdown, and automated rollback recommendations.</w:t>
+        <w:t>The CI/CD Build History interface displays comprehensive execution logs across pipeline runs, tracking build numbers, branches (main, develop, bugfix), triggering commit authors, execution dates, test pass/fail metrics, and direct links to automated failure attribution cards.</w:t>
       </w:r>
     </w:p>
     <w:p>
       <w:pPr>
         <w:keepNext/>
-        <w:spacing w:before="320" w:after="120"/>
+        <w:spacing w:before="360" w:after="120"/>
       </w:pPr>
       <w:r>
         <w:rPr>

</xml_diff>